<commit_message>
Hard Stop 2: record that the supervisor email was sent (Sep 26, 5:55 PM EDT) and the follow-up is drafted
Co-Authored-By: Claude Sonnet 5 <noreply@anthropic.com>
</commit_message>
<xml_diff>
--- a/docs/CISC699_HardStop2_DesignReview.docx
+++ b/docs/CISC699_HardStop2_DesignReview.docx
@@ -1937,7 +1937,7 @@
                 <w:sz w:val="20"/>
                 <w:szCs w:val="20"/>
               </w:rPr>
-              <w:t xml:space="preserve">Student decided whether and how to send the drafted supervisor-review request ahead of submission (see Section 11 for the outcome as of submission).</w:t>
+              <w:t xml:space="preserve">Student sent the supervisor-review email (Sep 26, 5:55 PM EDT) after the AI-drafted text was shortened and made more conversational at the student's direction; a follow-up on the later design change was drafted (see Section 11).</w:t>
             </w:r>
           </w:p>
         </w:tc>
@@ -2847,7 +2847,7 @@
                 <w:sz w:val="20"/>
                 <w:szCs w:val="20"/>
               </w:rPr>
-              <w:t xml:space="preserve">Section 11 documents a specific review request drafted as an Outlook message to the supervisor (offering a Teams meeting), not another self-review disclosure. Sending it is the student's own action; Section 11 states plainly whether it had been sent at submission.</w:t>
+              <w:t xml:space="preserve">A specific review request was emailed to the supervisor on Saturday, Sep 26 at 5:55 PM EDT, offering a Teams meeting (Section 11), not another self-review disclosure. A short follow-up describing the later design change has been drafted.</w:t>
             </w:r>
           </w:p>
         </w:tc>
@@ -14675,7 +14675,21 @@
           <w:sz w:val="22"/>
           <w:szCs w:val="22"/>
         </w:rPr>
-        <w:t xml:space="preserve">Applying the Week 3 feedback that a disclosed self-review does not substitute for the required supervisor review, a specific review request has been drafted as an Outlook message addressed to the supervisor, offering a short Teams meeting. It asks three things: (1) whether the archetype-based dynamic weighting and the scope expansion into needs-profile are acceptable, together with the AHP protocol (single judge, CR below 0.10, one-step sensitivity check); (2) whether the supervisor wants to act as a second AHP judge or review the matrices afterward; and (3) whether the seeded shelters, one real case, and eight annotated synthetic cases are enough for the Week 7 midpoint, given that one person annotated them.</w:t>
+        <w:t xml:space="preserve">Applying the Week 3 feedback that a disclosed self-review does not substitute for the required supervisor review, a specific review request was emailed to the supervisor on Saturday, Sep 26 at 5:55 PM EDT, offering a short Teams meeting. It asked about the AHP protocol as then planned (a single 5x5 matrix, a single judge, CR below 0.10, and a one-step sensitivity check), whether the supervisor wanted to act as a second judge, and whether the seeded shelters, one real case, and synthetic cases are enough evidence for the Week 7 midpoint.</w:t>
+      </w:r>
+    </w:p>
+    <w:p>
+      <w:pPr>
+        <w:spacing w:after="120" w:before="0" w:line="264"/>
+        <w:jc w:val="both"/>
+      </w:pPr>
+      <w:r>
+        <w:rPr>
+          <w:rFonts w:ascii="Calibri" w:cs="Calibri" w:eastAsia="Calibri" w:hAnsi="Calibri"/>
+          <w:sz w:val="22"/>
+          <w:szCs w:val="22"/>
+        </w:rPr>
+        <w:t xml:space="preserve">The design then changed (Section 2.2). A short follow-up describing the three-archetype approach, the 30 judgments it requires, and the scope expansion into needs-profile has been drafted; it re-frames the first question of the original note as "is this approach and scope reasonable?" The second and third questions stand. Separately, the synthetic cases were annotated by a single person, which this document discloses as a limitation (Section 8).</w:t>
       </w:r>
     </w:p>
     <w:p>
@@ -14690,7 +14704,7 @@
           <w:sz w:val="22"/>
           <w:szCs w:val="22"/>
         </w:rPr>
-        <w:t xml:space="preserve">•  Status: sending the request is the student's own action, and this document does not claim it was sent unless the student confirms it. Any response will be recorded as a dated revision note, not presented as having shaped this draft.</w:t>
+        <w:t xml:space="preserve">•  Status at the time of writing: no response had been received. Any response will be recorded as a dated revision note, not presented as having shaped this draft. The follow-up is drafted for the student to send and is not claimed as sent here.</w:t>
       </w:r>
     </w:p>
     <w:p>
@@ -22295,7 +22309,7 @@
                 <w:sz w:val="20"/>
                 <w:szCs w:val="20"/>
               </w:rPr>
-              <w:t xml:space="preserve">Student decided whether and how to send the drafted supervisor-review request ahead of submission.</w:t>
+              <w:t xml:space="preserve">Student sent the supervisor-review email (Sep 26, 5:55 PM EDT) after the AI-drafted text was shortened and made more conversational at the student's direction; a follow-up on the later design change was drafted.</w:t>
             </w:r>
           </w:p>
         </w:tc>

</xml_diff>

<commit_message>
Hard Stop 2: record both supervisor emails as sent; no further email, document in assignments
Co-Authored-By: Claude Sonnet 5 <noreply@anthropic.com>
</commit_message>
<xml_diff>
--- a/docs/CISC699_HardStop2_DesignReview.docx
+++ b/docs/CISC699_HardStop2_DesignReview.docx
@@ -1937,7 +1937,7 @@
                 <w:sz w:val="20"/>
                 <w:szCs w:val="20"/>
               </w:rPr>
-              <w:t xml:space="preserve">Student sent the supervisor-review email (Sep 26, 5:55 PM EDT) after the AI-drafted text was shortened and made more conversational at the student's direction; a follow-up on the later design change was drafted (see Section 11).</w:t>
+              <w:t xml:space="preserve">Student sent the supervisor-review email (Sep 26, 5:55 PM EDT) after the AI-drafted text was shortened and made more conversational at the student's direction; a follow-up on the later design change was sent at 7:14 PM EDT (see Section 11).</w:t>
             </w:r>
           </w:p>
         </w:tc>
@@ -3429,7 +3429,7 @@
                 <w:sz w:val="20"/>
                 <w:szCs w:val="20"/>
               </w:rPr>
-              <w:t xml:space="preserve">A specific review request was emailed to the supervisor on Saturday, Sep 26 at 5:55 PM EDT, offering a Teams meeting (Section 11), not another self-review disclosure. A short follow-up describing the later design change has been drafted.</w:t>
+              <w:t xml:space="preserve">A specific review request was emailed to the supervisor on Saturday, Sep 26 at 5:55 PM EDT, offering a Teams meeting (Section 11), not another self-review disclosure. A short follow-up describing the later design change was sent at 7:14 PM EDT the same evening.</w:t>
             </w:r>
           </w:p>
         </w:tc>
@@ -3924,7 +3924,7 @@
           <w:sz w:val="22"/>
           <w:szCs w:val="22"/>
         </w:rPr>
-        <w:t xml:space="preserve">•  RU-03 data inventory: the Week 3 brief said the needs profile was duplicated across the rescuenet-needs table and the Case item. It is not: no Lambda reads or writes rescuenet-needs, so it is an unused table, not a duplicate. The repository copy of the brief and the engineering log are corrected; the version already submitted still carries the original wording.</w:t>
+        <w:t xml:space="preserve">•  RU-03 data inventory: the Week 3 brief said the needs profile was duplicated across the rescuenet-needs table and the Case item. It is not: no Lambda reads or writes rescuenet-needs, so it is an unused table, not a duplicate. The repository copy of the brief and the engineering log are corrected; the version already submitted still carries the original wording. No separate email was sent about it; this section is the record.</w:t>
       </w:r>
     </w:p>
     <w:p>
@@ -19882,7 +19882,7 @@
           <w:sz w:val="22"/>
           <w:szCs w:val="22"/>
         </w:rPr>
-        <w:t xml:space="preserve">The design then changed (Section 2.2). A short follow-up describing the three-archetype approach, the 30 judgments it requires, and the scope expansion into needs-profile has been drafted; it re-frames the first question of the original note as "is this approach and scope reasonable?" The second and third questions stand. Separately, the synthetic cases were annotated by a single person, which this document discloses as a limitation (Section 8).</w:t>
+        <w:t xml:space="preserve">The design then changed (Section 2.2), so a short follow-up describing the three-archetype approach, the 30 judgments it requires, and the scope expansion into needs-profile was sent at 7:14 PM EDT the same evening. It re-framed the first question of the original note as "is this approach and scope reasonable?" The second and third questions stood. Separately, the synthetic cases were annotated by a single person, which this document discloses as a limitation (Section 8).</w:t>
       </w:r>
     </w:p>
     <w:p>
@@ -19897,7 +19897,22 @@
           <w:sz w:val="22"/>
           <w:szCs w:val="22"/>
         </w:rPr>
-        <w:t xml:space="preserve">•  Status at the time of writing: no response had been received. Any response will be recorded as a dated revision note, not presented as having shaped this draft. The follow-up is drafted for the student to send and is not claimed as sent here.</w:t>
+        <w:t xml:space="preserve">•  Status at the time of writing: no response had been received. Any response will be recorded as a dated revision note, not presented as having shaped this draft.</w:t>
+      </w:r>
+    </w:p>
+    <w:p>
+      <w:pPr>
+        <w:spacing w:after="80" w:before="0" w:line="264"/>
+        <w:ind w:left="450" w:hanging="270"/>
+        <w:jc w:val="both"/>
+      </w:pPr>
+      <w:r>
+        <w:rPr>
+          <w:rFonts w:ascii="Calibri" w:cs="Calibri" w:eastAsia="Calibri" w:hAnsi="Calibri"/>
+          <w:sz w:val="22"/>
+          <w:szCs w:val="22"/>
+        </w:rPr>
+        <w:t xml:space="preserve">•  Communication going forward: no further email will be sent to the supervisor. Questions, corrections, and status will be documented in the assignment submissions themselves (this section and Section 2.3), and any live discussion will happen through the offered Teams meeting or class time.</w:t>
       </w:r>
     </w:p>
     <w:p>
@@ -27676,7 +27691,7 @@
                 <w:sz w:val="20"/>
                 <w:szCs w:val="20"/>
               </w:rPr>
-              <w:t xml:space="preserve">Student sent the supervisor-review email (Sep 26, 5:55 PM EDT) after the AI-drafted text was shortened and made more conversational at the student's direction; a follow-up on the later design change was drafted.</w:t>
+              <w:t xml:space="preserve">Student sent the supervisor-review email (Sep 26, 5:55 PM EDT) after the AI-drafted text was shortened and made more conversational at the student's direction; a follow-up on the later design change was sent at 7:14 PM EDT.</w:t>
             </w:r>
           </w:p>
         </w:tc>

</xml_diff>

<commit_message>
Hard Stop 2: incorporate supervisor's approval and deterministic-blend requirement
Dr. Shaalan approved the three-archetype AHP approach (Sun 9/27, 8:59 PM EDT) with
one requirement: the blend must be deterministic, documented, and reproducible,
not a way of shifting the LLM-weighting problem upstream. Section 5.3 now states
explicitly that deriveWeights is a pure function with no model call, and that the
classifier producing p is the only non-deterministic step, measured by Section 8's
stability test. Section 11 quotes the response in full. AI_USE_LOG.md: Entry 16.

Co-Authored-By: Claude Sonnet 5 <noreply@anthropic.com>
</commit_message>
<xml_diff>
--- a/docs/CISC699_HardStop2_DesignReview.docx
+++ b/docs/CISC699_HardStop2_DesignReview.docx
@@ -168,7 +168,7 @@
           <w:sz w:val="22"/>
           <w:szCs w:val="22"/>
         </w:rPr>
-        <w:t xml:space="preserve">September 27, 2026 (Week 4)</w:t>
+        <w:t xml:space="preserve">September 28, 2026 (Week 4, revised per supervisor response)</w:t>
       </w:r>
     </w:p>
     <w:p>
@@ -3102,6 +3102,588 @@
                 <w:szCs w:val="20"/>
               </w:rPr>
               <w:t xml:space="preserve">Student requested the rubric check. Whether to tell the instructor about the RU-03 correction is the student's decision. Figures 2 and 3 were drawn by the AI as SVG from the verified design.</w:t>
+            </w:r>
+          </w:p>
+        </w:tc>
+      </w:tr>
+    </w:tbl>
+    <w:p>
+      <w:pPr>
+        <w:spacing w:after="0" w:before="0" w:line="264"/>
+      </w:pPr>
+      <w:r>
+        <w:rPr>
+          <w:rFonts w:ascii="Calibri" w:cs="Calibri" w:eastAsia="Calibri" w:hAnsi="Calibri"/>
+          <w:sz w:val="22"/>
+          <w:szCs w:val="22"/>
+        </w:rPr>
+        <w:t xml:space="preserve"/>
+      </w:r>
+    </w:p>
+    <w:p>
+      <w:pPr>
+        <w:keepNext/>
+        <w:spacing w:after="60" w:before="120" w:line="264"/>
+      </w:pPr>
+      <w:r>
+        <w:rPr>
+          <w:rFonts w:ascii="Calibri" w:cs="Calibri" w:eastAsia="Calibri" w:hAnsi="Calibri"/>
+          <w:b/>
+          <w:bCs/>
+          <w:i/>
+          <w:iCs/>
+          <w:sz w:val="22"/>
+          <w:szCs w:val="22"/>
+        </w:rPr>
+        <w:t xml:space="preserve">Entry 16 — Incorporating the Supervisor's Response</w:t>
+      </w:r>
+    </w:p>
+    <w:tbl>
+      <w:tblPr>
+        <w:tblW w:type="dxa" w:w="9360"/>
+        <w:tblBorders>
+          <w:top w:val="single" w:color="999999" w:sz="4"/>
+          <w:left w:val="single" w:color="999999" w:sz="4"/>
+          <w:bottom w:val="single" w:color="999999" w:sz="4"/>
+          <w:right w:val="single" w:color="999999" w:sz="4"/>
+          <w:insideH w:val="single" w:color="CCCCCC" w:sz="2"/>
+          <w:insideV w:val="single" w:color="CCCCCC" w:sz="2"/>
+        </w:tblBorders>
+      </w:tblPr>
+      <w:tblGrid>
+        <w:gridCol w:w="2400"/>
+        <w:gridCol w:w="6960"/>
+      </w:tblGrid>
+      <w:tr>
+        <w:trPr>
+          <w:cantSplit/>
+          <w:tblHeader/>
+        </w:trPr>
+        <w:tc>
+          <w:tcPr>
+            <w:tcW w:type="dxa" w:w="2400"/>
+            <w:shd w:fill="E8F3EF" w:val="clear"/>
+            <w:tcMar>
+              <w:top w:type="dxa" w:w="80"/>
+              <w:left w:type="dxa" w:w="100"/>
+              <w:bottom w:type="dxa" w:w="80"/>
+              <w:right w:type="dxa" w:w="100"/>
+            </w:tcMar>
+            <w:vAlign w:val="top"/>
+          </w:tcPr>
+          <w:p>
+            <w:pPr>
+              <w:spacing w:after="0" w:before="0" w:line="250"/>
+            </w:pPr>
+            <w:r>
+              <w:rPr>
+                <w:rFonts w:ascii="Calibri" w:cs="Calibri" w:eastAsia="Calibri" w:hAnsi="Calibri"/>
+                <w:b/>
+                <w:bCs/>
+                <w:sz w:val="20"/>
+                <w:szCs w:val="20"/>
+              </w:rPr>
+              <w:t xml:space="preserve">Field</w:t>
+            </w:r>
+          </w:p>
+        </w:tc>
+        <w:tc>
+          <w:tcPr>
+            <w:tcW w:type="dxa" w:w="6960"/>
+            <w:shd w:fill="E8F3EF" w:val="clear"/>
+            <w:tcMar>
+              <w:top w:type="dxa" w:w="80"/>
+              <w:left w:type="dxa" w:w="100"/>
+              <w:bottom w:type="dxa" w:w="80"/>
+              <w:right w:type="dxa" w:w="100"/>
+            </w:tcMar>
+            <w:vAlign w:val="top"/>
+          </w:tcPr>
+          <w:p>
+            <w:pPr>
+              <w:spacing w:after="0" w:before="0" w:line="250"/>
+            </w:pPr>
+            <w:r>
+              <w:rPr>
+                <w:rFonts w:ascii="Calibri" w:cs="Calibri" w:eastAsia="Calibri" w:hAnsi="Calibri"/>
+                <w:b/>
+                <w:bCs/>
+                <w:sz w:val="20"/>
+                <w:szCs w:val="20"/>
+              </w:rPr>
+              <w:t xml:space="preserve">Detail</w:t>
+            </w:r>
+          </w:p>
+        </w:tc>
+      </w:tr>
+      <w:tr>
+        <w:trPr>
+          <w:cantSplit/>
+        </w:trPr>
+        <w:tc>
+          <w:tcPr>
+            <w:tcW w:type="dxa" w:w="2400"/>
+            <w:tcMar>
+              <w:top w:type="dxa" w:w="80"/>
+              <w:left w:type="dxa" w:w="100"/>
+              <w:bottom w:type="dxa" w:w="80"/>
+              <w:right w:type="dxa" w:w="100"/>
+            </w:tcMar>
+            <w:vAlign w:val="top"/>
+          </w:tcPr>
+          <w:p>
+            <w:pPr>
+              <w:spacing w:after="0" w:before="0" w:line="250"/>
+            </w:pPr>
+            <w:r>
+              <w:rPr>
+                <w:rFonts w:ascii="Calibri" w:cs="Calibri" w:eastAsia="Calibri" w:hAnsi="Calibri"/>
+                <w:b w:val="false"/>
+                <w:bCs w:val="false"/>
+                <w:sz w:val="20"/>
+                <w:szCs w:val="20"/>
+              </w:rPr>
+              <w:t xml:space="preserve">Tool</w:t>
+            </w:r>
+          </w:p>
+        </w:tc>
+        <w:tc>
+          <w:tcPr>
+            <w:tcW w:type="dxa" w:w="6960"/>
+            <w:tcMar>
+              <w:top w:type="dxa" w:w="80"/>
+              <w:left w:type="dxa" w:w="100"/>
+              <w:bottom w:type="dxa" w:w="80"/>
+              <w:right w:type="dxa" w:w="100"/>
+            </w:tcMar>
+            <w:vAlign w:val="top"/>
+          </w:tcPr>
+          <w:p>
+            <w:pPr>
+              <w:spacing w:after="0" w:before="0" w:line="250"/>
+            </w:pPr>
+            <w:r>
+              <w:rPr>
+                <w:rFonts w:ascii="Calibri" w:cs="Calibri" w:eastAsia="Calibri" w:hAnsi="Calibri"/>
+                <w:b w:val="false"/>
+                <w:bCs w:val="false"/>
+                <w:sz w:val="20"/>
+                <w:szCs w:val="20"/>
+              </w:rPr>
+              <w:t xml:space="preserve">Claude (Anthropic, Claude Sonnet 5)</w:t>
+            </w:r>
+          </w:p>
+        </w:tc>
+      </w:tr>
+      <w:tr>
+        <w:trPr>
+          <w:cantSplit/>
+        </w:trPr>
+        <w:tc>
+          <w:tcPr>
+            <w:tcW w:type="dxa" w:w="2400"/>
+            <w:tcMar>
+              <w:top w:type="dxa" w:w="80"/>
+              <w:left w:type="dxa" w:w="100"/>
+              <w:bottom w:type="dxa" w:w="80"/>
+              <w:right w:type="dxa" w:w="100"/>
+            </w:tcMar>
+            <w:vAlign w:val="top"/>
+          </w:tcPr>
+          <w:p>
+            <w:pPr>
+              <w:spacing w:after="0" w:before="0" w:line="250"/>
+            </w:pPr>
+            <w:r>
+              <w:rPr>
+                <w:rFonts w:ascii="Calibri" w:cs="Calibri" w:eastAsia="Calibri" w:hAnsi="Calibri"/>
+                <w:b w:val="false"/>
+                <w:bCs w:val="false"/>
+                <w:sz w:val="20"/>
+                <w:szCs w:val="20"/>
+              </w:rPr>
+              <w:t xml:space="preserve">Date / Phase</w:t>
+            </w:r>
+          </w:p>
+        </w:tc>
+        <w:tc>
+          <w:tcPr>
+            <w:tcW w:type="dxa" w:w="6960"/>
+            <w:tcMar>
+              <w:top w:type="dxa" w:w="80"/>
+              <w:left w:type="dxa" w:w="100"/>
+              <w:bottom w:type="dxa" w:w="80"/>
+              <w:right w:type="dxa" w:w="100"/>
+            </w:tcMar>
+            <w:vAlign w:val="top"/>
+          </w:tcPr>
+          <w:p>
+            <w:pPr>
+              <w:spacing w:after="0" w:before="0" w:line="250"/>
+            </w:pPr>
+            <w:r>
+              <w:rPr>
+                <w:rFonts w:ascii="Calibri" w:cs="Calibri" w:eastAsia="Calibri" w:hAnsi="Calibri"/>
+                <w:b w:val="false"/>
+                <w:bCs w:val="false"/>
+                <w:sz w:val="20"/>
+                <w:szCs w:val="20"/>
+              </w:rPr>
+              <w:t xml:space="preserve">Week 4 (2026-09-28), revision after supervisor reply</w:t>
+            </w:r>
+          </w:p>
+        </w:tc>
+      </w:tr>
+      <w:tr>
+        <w:trPr>
+          <w:cantSplit/>
+        </w:trPr>
+        <w:tc>
+          <w:tcPr>
+            <w:tcW w:type="dxa" w:w="2400"/>
+            <w:tcMar>
+              <w:top w:type="dxa" w:w="80"/>
+              <w:left w:type="dxa" w:w="100"/>
+              <w:bottom w:type="dxa" w:w="80"/>
+              <w:right w:type="dxa" w:w="100"/>
+            </w:tcMar>
+            <w:vAlign w:val="top"/>
+          </w:tcPr>
+          <w:p>
+            <w:pPr>
+              <w:spacing w:after="0" w:before="0" w:line="250"/>
+            </w:pPr>
+            <w:r>
+              <w:rPr>
+                <w:rFonts w:ascii="Calibri" w:cs="Calibri" w:eastAsia="Calibri" w:hAnsi="Calibri"/>
+                <w:b w:val="false"/>
+                <w:bCs w:val="false"/>
+                <w:sz w:val="20"/>
+                <w:szCs w:val="20"/>
+              </w:rPr>
+              <w:t xml:space="preserve">Purpose</w:t>
+            </w:r>
+          </w:p>
+        </w:tc>
+        <w:tc>
+          <w:tcPr>
+            <w:tcW w:type="dxa" w:w="6960"/>
+            <w:tcMar>
+              <w:top w:type="dxa" w:w="80"/>
+              <w:left w:type="dxa" w:w="100"/>
+              <w:bottom w:type="dxa" w:w="80"/>
+              <w:right w:type="dxa" w:w="100"/>
+            </w:tcMar>
+            <w:vAlign w:val="top"/>
+          </w:tcPr>
+          <w:p>
+            <w:pPr>
+              <w:spacing w:after="0" w:before="0" w:line="250"/>
+            </w:pPr>
+            <w:r>
+              <w:rPr>
+                <w:rFonts w:ascii="Calibri" w:cs="Calibri" w:eastAsia="Calibri" w:hAnsi="Calibri"/>
+                <w:b w:val="false"/>
+                <w:bCs w:val="false"/>
+                <w:sz w:val="20"/>
+                <w:szCs w:val="20"/>
+              </w:rPr>
+              <w:t xml:space="preserve">Read the supervisor's actual reply to the two emailed requests and revise the design and Section 11 to act on it, rather than only disclosing that a reply was expected.</w:t>
+            </w:r>
+          </w:p>
+        </w:tc>
+      </w:tr>
+      <w:tr>
+        <w:trPr>
+          <w:cantSplit/>
+        </w:trPr>
+        <w:tc>
+          <w:tcPr>
+            <w:tcW w:type="dxa" w:w="2400"/>
+            <w:tcMar>
+              <w:top w:type="dxa" w:w="80"/>
+              <w:left w:type="dxa" w:w="100"/>
+              <w:bottom w:type="dxa" w:w="80"/>
+              <w:right w:type="dxa" w:w="100"/>
+            </w:tcMar>
+            <w:vAlign w:val="top"/>
+          </w:tcPr>
+          <w:p>
+            <w:pPr>
+              <w:spacing w:after="0" w:before="0" w:line="250"/>
+            </w:pPr>
+            <w:r>
+              <w:rPr>
+                <w:rFonts w:ascii="Calibri" w:cs="Calibri" w:eastAsia="Calibri" w:hAnsi="Calibri"/>
+                <w:b w:val="false"/>
+                <w:bCs w:val="false"/>
+                <w:sz w:val="20"/>
+                <w:szCs w:val="20"/>
+              </w:rPr>
+              <w:t xml:space="preserve">Prompt / Task Summary</w:t>
+            </w:r>
+          </w:p>
+        </w:tc>
+        <w:tc>
+          <w:tcPr>
+            <w:tcW w:type="dxa" w:w="6960"/>
+            <w:tcMar>
+              <w:top w:type="dxa" w:w="80"/>
+              <w:left w:type="dxa" w:w="100"/>
+              <w:bottom w:type="dxa" w:w="80"/>
+              <w:right w:type="dxa" w:w="100"/>
+            </w:tcMar>
+            <w:vAlign w:val="top"/>
+          </w:tcPr>
+          <w:p>
+            <w:pPr>
+              <w:spacing w:after="0" w:before="0" w:line="250"/>
+            </w:pPr>
+            <w:r>
+              <w:rPr>
+                <w:rFonts w:ascii="Calibri" w:cs="Calibri" w:eastAsia="Calibri" w:hAnsi="Calibri"/>
+                <w:b w:val="false"/>
+                <w:bCs w:val="false"/>
+                <w:sz w:val="20"/>
+                <w:szCs w:val="20"/>
+              </w:rPr>
+              <w:t xml:space="preserve">Open and quote the supervisor's Sep 27, 8:59 PM EDT reply approving the three-archetype approach and requiring the blend to be explicit about being deterministic, documented, and reproducible; add that explicit statement to Section 5.3; update Section 11 with the quoted response and what was and was not directly addressed; note the class-wide deadline extension to Sep 29 and that this revision is being made to act on the response, not merely to use extra time.</w:t>
+            </w:r>
+          </w:p>
+        </w:tc>
+      </w:tr>
+      <w:tr>
+        <w:trPr>
+          <w:cantSplit/>
+        </w:trPr>
+        <w:tc>
+          <w:tcPr>
+            <w:tcW w:type="dxa" w:w="2400"/>
+            <w:tcMar>
+              <w:top w:type="dxa" w:w="80"/>
+              <w:left w:type="dxa" w:w="100"/>
+              <w:bottom w:type="dxa" w:w="80"/>
+              <w:right w:type="dxa" w:w="100"/>
+            </w:tcMar>
+            <w:vAlign w:val="top"/>
+          </w:tcPr>
+          <w:p>
+            <w:pPr>
+              <w:spacing w:after="0" w:before="0" w:line="250"/>
+            </w:pPr>
+            <w:r>
+              <w:rPr>
+                <w:rFonts w:ascii="Calibri" w:cs="Calibri" w:eastAsia="Calibri" w:hAnsi="Calibri"/>
+                <w:b w:val="false"/>
+                <w:bCs w:val="false"/>
+                <w:sz w:val="20"/>
+                <w:szCs w:val="20"/>
+              </w:rPr>
+              <w:t xml:space="preserve">Output Used</w:t>
+            </w:r>
+          </w:p>
+        </w:tc>
+        <w:tc>
+          <w:tcPr>
+            <w:tcW w:type="dxa" w:w="6960"/>
+            <w:tcMar>
+              <w:top w:type="dxa" w:w="80"/>
+              <w:left w:type="dxa" w:w="100"/>
+              <w:bottom w:type="dxa" w:w="80"/>
+              <w:right w:type="dxa" w:w="100"/>
+            </w:tcMar>
+            <w:vAlign w:val="top"/>
+          </w:tcPr>
+          <w:p>
+            <w:pPr>
+              <w:spacing w:after="0" w:before="0" w:line="250"/>
+            </w:pPr>
+            <w:r>
+              <w:rPr>
+                <w:rFonts w:ascii="Calibri" w:cs="Calibri" w:eastAsia="Calibri" w:hAnsi="Calibri"/>
+                <w:b w:val="false"/>
+                <w:bCs w:val="false"/>
+                <w:sz w:val="20"/>
+                <w:szCs w:val="20"/>
+              </w:rPr>
+              <w:t xml:space="preserve">Revised Sections 5.3 and 11.</w:t>
+            </w:r>
+          </w:p>
+        </w:tc>
+      </w:tr>
+      <w:tr>
+        <w:trPr>
+          <w:cantSplit/>
+        </w:trPr>
+        <w:tc>
+          <w:tcPr>
+            <w:tcW w:type="dxa" w:w="2400"/>
+            <w:tcMar>
+              <w:top w:type="dxa" w:w="80"/>
+              <w:left w:type="dxa" w:w="100"/>
+              <w:bottom w:type="dxa" w:w="80"/>
+              <w:right w:type="dxa" w:w="100"/>
+            </w:tcMar>
+            <w:vAlign w:val="top"/>
+          </w:tcPr>
+          <w:p>
+            <w:pPr>
+              <w:spacing w:after="0" w:before="0" w:line="250"/>
+            </w:pPr>
+            <w:r>
+              <w:rPr>
+                <w:rFonts w:ascii="Calibri" w:cs="Calibri" w:eastAsia="Calibri" w:hAnsi="Calibri"/>
+                <w:b w:val="false"/>
+                <w:bCs w:val="false"/>
+                <w:sz w:val="20"/>
+                <w:szCs w:val="20"/>
+              </w:rPr>
+              <w:t xml:space="preserve">Affected Section / Artifact</w:t>
+            </w:r>
+          </w:p>
+        </w:tc>
+        <w:tc>
+          <w:tcPr>
+            <w:tcW w:type="dxa" w:w="6960"/>
+            <w:tcMar>
+              <w:top w:type="dxa" w:w="80"/>
+              <w:left w:type="dxa" w:w="100"/>
+              <w:bottom w:type="dxa" w:w="80"/>
+              <w:right w:type="dxa" w:w="100"/>
+            </w:tcMar>
+            <w:vAlign w:val="top"/>
+          </w:tcPr>
+          <w:p>
+            <w:pPr>
+              <w:spacing w:after="0" w:before="0" w:line="250"/>
+            </w:pPr>
+            <w:r>
+              <w:rPr>
+                <w:rFonts w:ascii="Calibri" w:cs="Calibri" w:eastAsia="Calibri" w:hAnsi="Calibri"/>
+                <w:b w:val="false"/>
+                <w:bCs w:val="false"/>
+                <w:sz w:val="20"/>
+                <w:szCs w:val="20"/>
+              </w:rPr>
+              <w:t xml:space="preserve">Sections 5.3, 11.</w:t>
+            </w:r>
+          </w:p>
+        </w:tc>
+      </w:tr>
+      <w:tr>
+        <w:trPr>
+          <w:cantSplit/>
+        </w:trPr>
+        <w:tc>
+          <w:tcPr>
+            <w:tcW w:type="dxa" w:w="2400"/>
+            <w:tcMar>
+              <w:top w:type="dxa" w:w="80"/>
+              <w:left w:type="dxa" w:w="100"/>
+              <w:bottom w:type="dxa" w:w="80"/>
+              <w:right w:type="dxa" w:w="100"/>
+            </w:tcMar>
+            <w:vAlign w:val="top"/>
+          </w:tcPr>
+          <w:p>
+            <w:pPr>
+              <w:spacing w:after="0" w:before="0" w:line="250"/>
+            </w:pPr>
+            <w:r>
+              <w:rPr>
+                <w:rFonts w:ascii="Calibri" w:cs="Calibri" w:eastAsia="Calibri" w:hAnsi="Calibri"/>
+                <w:b w:val="false"/>
+                <w:bCs w:val="false"/>
+                <w:sz w:val="20"/>
+                <w:szCs w:val="20"/>
+              </w:rPr>
+              <w:t xml:space="preserve">Human Verification</w:t>
+            </w:r>
+          </w:p>
+        </w:tc>
+        <w:tc>
+          <w:tcPr>
+            <w:tcW w:type="dxa" w:w="6960"/>
+            <w:tcMar>
+              <w:top w:type="dxa" w:w="80"/>
+              <w:left w:type="dxa" w:w="100"/>
+              <w:bottom w:type="dxa" w:w="80"/>
+              <w:right w:type="dxa" w:w="100"/>
+            </w:tcMar>
+            <w:vAlign w:val="top"/>
+          </w:tcPr>
+          <w:p>
+            <w:pPr>
+              <w:spacing w:after="0" w:before="0" w:line="250"/>
+            </w:pPr>
+            <w:r>
+              <w:rPr>
+                <w:rFonts w:ascii="Calibri" w:cs="Calibri" w:eastAsia="Calibri" w:hAnsi="Calibri"/>
+                <w:b w:val="false"/>
+                <w:bCs w:val="false"/>
+                <w:sz w:val="20"/>
+                <w:szCs w:val="20"/>
+              </w:rPr>
+              <w:t xml:space="preserve">The quoted reply was read directly from Outlook, not paraphrased from memory; the Canvas assignment page was checked directly for the real extended availability date (Sep 29, 11:59 PM) rather than computing it from the announcement's "two days" wording alone.</w:t>
+            </w:r>
+          </w:p>
+        </w:tc>
+      </w:tr>
+      <w:tr>
+        <w:trPr>
+          <w:cantSplit/>
+        </w:trPr>
+        <w:tc>
+          <w:tcPr>
+            <w:tcW w:type="dxa" w:w="2400"/>
+            <w:tcMar>
+              <w:top w:type="dxa" w:w="80"/>
+              <w:left w:type="dxa" w:w="100"/>
+              <w:bottom w:type="dxa" w:w="80"/>
+              <w:right w:type="dxa" w:w="100"/>
+            </w:tcMar>
+            <w:vAlign w:val="top"/>
+          </w:tcPr>
+          <w:p>
+            <w:pPr>
+              <w:spacing w:after="0" w:before="0" w:line="250"/>
+            </w:pPr>
+            <w:r>
+              <w:rPr>
+                <w:rFonts w:ascii="Calibri" w:cs="Calibri" w:eastAsia="Calibri" w:hAnsi="Calibri"/>
+                <w:b w:val="false"/>
+                <w:bCs w:val="false"/>
+                <w:sz w:val="20"/>
+                <w:szCs w:val="20"/>
+              </w:rPr>
+              <w:t xml:space="preserve">Final Student Revisions</w:t>
+            </w:r>
+          </w:p>
+        </w:tc>
+        <w:tc>
+          <w:tcPr>
+            <w:tcW w:type="dxa" w:w="6960"/>
+            <w:tcMar>
+              <w:top w:type="dxa" w:w="80"/>
+              <w:left w:type="dxa" w:w="100"/>
+              <w:bottom w:type="dxa" w:w="80"/>
+              <w:right w:type="dxa" w:w="100"/>
+            </w:tcMar>
+            <w:vAlign w:val="top"/>
+          </w:tcPr>
+          <w:p>
+            <w:pPr>
+              <w:spacing w:after="0" w:before="0" w:line="250"/>
+            </w:pPr>
+            <w:r>
+              <w:rPr>
+                <w:rFonts w:ascii="Calibri" w:cs="Calibri" w:eastAsia="Calibri" w:hAnsi="Calibri"/>
+                <w:b w:val="false"/>
+                <w:bCs w:val="false"/>
+                <w:sz w:val="20"/>
+                <w:szCs w:val="20"/>
+              </w:rPr>
+              <w:t xml:space="preserve">Student decided that the second-judge and evidence-base questions, not directly addressed in the reply, would be treated as resolved by proceeding rather than re-asked, consistent with the decision to stop emailing and document instead.</w:t>
             </w:r>
           </w:p>
         </w:tc>
@@ -7798,7 +8380,7 @@
           <w:sz w:val="22"/>
           <w:szCs w:val="22"/>
         </w:rPr>
-        <w:t xml:space="preserve">This gives the design its dynamism: a mostly-injured but somewhat-urgent animal gets a blend, and the weights vary continuously with the case. It also gives properties that are testable: each vector sums to 1, so w(case) sums to 1 automatically; each component stays between the smallest and largest archetype value; a one-hot p returns exactly that archetype's AHP vector; and, given p, the weights and every downstream score are fully deterministic and reproducible. Hard constraints (has_vet, accepts_species) are unchanged, so a mandatory need is never rescued or overridden by a weighted score.</w:t>
+        <w:t xml:space="preserve">This gives the design its dynamism: a mostly-injured but somewhat-urgent animal gets a blend, and the weights vary continuously with the case. It also gives properties that are testable: each vector sums to 1, so w(case) sums to 1 automatically; each component stays between the smallest and largest archetype value; a one-hot p returns exactly that archetype's AHP vector; and, given p, the weights and every downstream score are fully deterministic and reproducible. To be explicit about where the only non-determinism in this design lives, per the supervisor's Sep 27 request: deriveWeights itself is a pure function with no model call and no randomness. w(case) is exactly reproducible from p. The single non-deterministic step in the whole path is the upstream Bedrock classification that produces p, which is why Section 6 sets its temperature to 0 and Section 8's classifier-stability test exists specifically to measure how much that one step still varies run to run, rather than letting that variance quietly pass through as if it were part of the weighting method. Hard constraints (has_vet, accepts_species) are unchanged, so a mandatory need is never rescued or overridden by a weighted score.</w:t>
       </w:r>
     </w:p>
     <w:p>
@@ -19882,7 +20464,39 @@
           <w:sz w:val="22"/>
           <w:szCs w:val="22"/>
         </w:rPr>
-        <w:t xml:space="preserve">The design then changed (Section 2.2), so a short follow-up describing the three-archetype approach, the 30 judgments it requires, and the scope expansion into needs-profile was sent at 7:14 PM EDT the same evening. It re-framed the first question of the original note as "is this approach and scope reasonable?" The second and third questions stood. Separately, the synthetic cases were annotated by a single person, which this document discloses as a limitation (Section 8).</w:t>
+        <w:t xml:space="preserve">The design then changed (Section 2.2), so a short follow-up describing the three-archetype approach, the 30 judgments it requires, and the scope expansion into needs-profile was sent at 7:14 PM EDT the same evening. It re-framed the first question of the original note as "is this approach and scope reasonable?"</w:t>
+      </w:r>
+    </w:p>
+    <w:p>
+      <w:pPr>
+        <w:keepNext/>
+        <w:spacing w:after="60" w:before="120" w:line="264"/>
+      </w:pPr>
+      <w:r>
+        <w:rPr>
+          <w:rFonts w:ascii="Calibri" w:cs="Calibri" w:eastAsia="Calibri" w:hAnsi="Calibri"/>
+          <w:b/>
+          <w:bCs/>
+          <w:i/>
+          <w:iCs/>
+          <w:sz w:val="22"/>
+          <w:szCs w:val="22"/>
+        </w:rPr>
+        <w:t xml:space="preserve">Supervisor Response (received Sunday, Sep 27, 8:59 PM EDT)</w:t>
+      </w:r>
+    </w:p>
+    <w:p>
+      <w:pPr>
+        <w:spacing w:after="120" w:before="0" w:line="264"/>
+        <w:jc w:val="both"/>
+      </w:pPr>
+      <w:r>
+        <w:rPr>
+          <w:rFonts w:ascii="Calibri" w:cs="Calibri" w:eastAsia="Calibri" w:hAnsi="Calibri"/>
+          <w:sz w:val="22"/>
+          <w:szCs w:val="22"/>
+        </w:rPr>
+        <w:t xml:space="preserve">Quoted in full: "Yes, the three-profile AHP approach sounds reasonable and is preferable to forcing one fixed weighting scheme across materially different case types. The main thing I want you to make explicit is how the three profiles are blended for a given case, the blending mechanism itself needs to be deterministic, documented, and reproducible rather than simply shifting the current LLM-weighting problem upstream. Keep the scope limited to those three profiles."</w:t>
       </w:r>
     </w:p>
     <w:p>
@@ -19897,7 +20511,7 @@
           <w:sz w:val="22"/>
           <w:szCs w:val="22"/>
         </w:rPr>
-        <w:t xml:space="preserve">•  Status at the time of writing: no response had been received. Any response will be recorded as a dated revision note, not presented as having shaped this draft.</w:t>
+        <w:t xml:space="preserve">•  Approval: the three-archetype approach and the scope expansion into needs-profile are approved. The cap at three archetypes (already the design's own decision in Section 10) is now also a supervisor instruction, not just a self-imposed limit — no fourth archetype will be added this term.</w:t>
       </w:r>
     </w:p>
     <w:p>
@@ -19912,7 +20526,52 @@
           <w:sz w:val="22"/>
           <w:szCs w:val="22"/>
         </w:rPr>
-        <w:t xml:space="preserve">•  Communication going forward: no further email will be sent to the supervisor. Questions, corrections, and status will be documented in the assignment submissions themselves (this section and Section 2.3), and any live discussion will happen through the offered Teams meeting or class time.</w:t>
+        <w:t xml:space="preserve">•  Action taken on the one substantive requirement: Section 5.3 was revised the same day to state explicitly that deriveWeights is a pure, deterministic function with no model call, and that the only non-determinism in the path is the upstream classifier producing p — exactly the "shifting the problem upstream" risk the supervisor named, and exactly what Section 8's classifier-stability test was already built to measure. This closes the one open item from the response.</w:t>
+      </w:r>
+    </w:p>
+    <w:p>
+      <w:pPr>
+        <w:spacing w:after="80" w:before="0" w:line="264"/>
+        <w:ind w:left="450" w:hanging="270"/>
+        <w:jc w:val="both"/>
+      </w:pPr>
+      <w:r>
+        <w:rPr>
+          <w:rFonts w:ascii="Calibri" w:cs="Calibri" w:eastAsia="Calibri" w:hAnsi="Calibri"/>
+          <w:sz w:val="22"/>
+          <w:szCs w:val="22"/>
+        </w:rPr>
+        <w:t xml:space="preserve">•  Second-judge and evidence-base questions: not directly addressed in the reply. Treated as implicitly resolved in favor of proceeding as proposed (single judge, current evidence base), since the response approved the approach without raising them; not re-asked, per the decision below to stop emailing and document instead.</w:t>
+      </w:r>
+    </w:p>
+    <w:p>
+      <w:pPr>
+        <w:spacing w:after="80" w:before="0" w:line="264"/>
+        <w:ind w:left="450" w:hanging="270"/>
+        <w:jc w:val="both"/>
+      </w:pPr>
+      <w:r>
+        <w:rPr>
+          <w:rFonts w:ascii="Calibri" w:cs="Calibri" w:eastAsia="Calibri" w:hAnsi="Calibri"/>
+          <w:sz w:val="22"/>
+          <w:szCs w:val="22"/>
+        </w:rPr>
+        <w:t xml:space="preserve">•  Communication going forward: no further email will be sent to the supervisor. Any further questions, corrections, or status will be documented in the assignment submissions themselves (this section and Section 2.3), and any live discussion will happen through the offered Teams meeting or class time.</w:t>
+      </w:r>
+    </w:p>
+    <w:p>
+      <w:pPr>
+        <w:spacing w:after="80" w:before="0" w:line="264"/>
+        <w:ind w:left="450" w:hanging="270"/>
+        <w:jc w:val="both"/>
+      </w:pPr>
+      <w:r>
+        <w:rPr>
+          <w:rFonts w:ascii="Calibri" w:cs="Calibri" w:eastAsia="Calibri" w:hAnsi="Calibri"/>
+          <w:sz w:val="22"/>
+          <w:szCs w:val="22"/>
+        </w:rPr>
+        <w:t xml:space="preserve">•  Deadline note: a class-wide announcement (Mon, Sep 28) extended this submission's window to Sep 29, 11:59 PM, since the supervisor is traveling and begins evaluation Wednesday. This document is being revised and resubmitted within that extended window specifically to act on the response above, not merely to use the extra time.</w:t>
       </w:r>
     </w:p>
     <w:p>
@@ -20140,7 +20799,7 @@
           <w:sz w:val="22"/>
           <w:szCs w:val="22"/>
         </w:rPr>
-        <w:t xml:space="preserve">Reproduced in full, parsed directly from docs/AI_USE_LOG.md at the project root (Entries 1-15, cumulative across all submissions this term), not retyped by hand.</w:t>
+        <w:t xml:space="preserve">Reproduced in full, parsed directly from docs/AI_USE_LOG.md at the project root (Entries 1-16, cumulative across all submissions this term), not retyped by hand.</w:t>
       </w:r>
     </w:p>
     <w:p>
@@ -28854,6 +29513,587 @@
                 <w:szCs w:val="20"/>
               </w:rPr>
               <w:t xml:space="preserve">Student requested the rubric check. Whether to tell the instructor about the RU-03 correction is the student's decision. Figures 2 and 3 were drawn by the AI as SVG from the verified design.</w:t>
+            </w:r>
+          </w:p>
+        </w:tc>
+      </w:tr>
+    </w:tbl>
+    <w:p>
+      <w:pPr>
+        <w:spacing w:after="0" w:before="0" w:line="264"/>
+      </w:pPr>
+      <w:r>
+        <w:rPr>
+          <w:rFonts w:ascii="Calibri" w:cs="Calibri" w:eastAsia="Calibri" w:hAnsi="Calibri"/>
+          <w:sz w:val="22"/>
+          <w:szCs w:val="22"/>
+        </w:rPr>
+        <w:t xml:space="preserve"/>
+      </w:r>
+    </w:p>
+    <w:p>
+      <w:pPr>
+        <w:keepNext/>
+        <w:spacing w:after="100" w:before="200" w:line="264"/>
+      </w:pPr>
+      <w:r>
+        <w:rPr>
+          <w:rFonts w:ascii="Calibri" w:cs="Calibri" w:eastAsia="Calibri" w:hAnsi="Calibri"/>
+          <w:b/>
+          <w:bCs/>
+          <w:color w:val="0A3A35"/>
+          <w:sz w:val="24"/>
+          <w:szCs w:val="24"/>
+        </w:rPr>
+        <w:t xml:space="preserve">Entry 16 — Incorporating the Supervisor's Response</w:t>
+      </w:r>
+    </w:p>
+    <w:tbl>
+      <w:tblPr>
+        <w:tblW w:type="dxa" w:w="9360"/>
+        <w:tblBorders>
+          <w:top w:val="single" w:color="999999" w:sz="4"/>
+          <w:left w:val="single" w:color="999999" w:sz="4"/>
+          <w:bottom w:val="single" w:color="999999" w:sz="4"/>
+          <w:right w:val="single" w:color="999999" w:sz="4"/>
+          <w:insideH w:val="single" w:color="CCCCCC" w:sz="2"/>
+          <w:insideV w:val="single" w:color="CCCCCC" w:sz="2"/>
+        </w:tblBorders>
+      </w:tblPr>
+      <w:tblGrid>
+        <w:gridCol w:w="2400"/>
+        <w:gridCol w:w="6960"/>
+      </w:tblGrid>
+      <w:tr>
+        <w:trPr>
+          <w:cantSplit/>
+          <w:tblHeader/>
+        </w:trPr>
+        <w:tc>
+          <w:tcPr>
+            <w:tcW w:type="dxa" w:w="2400"/>
+            <w:shd w:fill="E8F3EF" w:val="clear"/>
+            <w:tcMar>
+              <w:top w:type="dxa" w:w="80"/>
+              <w:left w:type="dxa" w:w="100"/>
+              <w:bottom w:type="dxa" w:w="80"/>
+              <w:right w:type="dxa" w:w="100"/>
+            </w:tcMar>
+            <w:vAlign w:val="top"/>
+          </w:tcPr>
+          <w:p>
+            <w:pPr>
+              <w:spacing w:after="0" w:before="0" w:line="250"/>
+            </w:pPr>
+            <w:r>
+              <w:rPr>
+                <w:rFonts w:ascii="Calibri" w:cs="Calibri" w:eastAsia="Calibri" w:hAnsi="Calibri"/>
+                <w:b/>
+                <w:bCs/>
+                <w:sz w:val="20"/>
+                <w:szCs w:val="20"/>
+              </w:rPr>
+              <w:t xml:space="preserve">Field</w:t>
+            </w:r>
+          </w:p>
+        </w:tc>
+        <w:tc>
+          <w:tcPr>
+            <w:tcW w:type="dxa" w:w="6960"/>
+            <w:shd w:fill="E8F3EF" w:val="clear"/>
+            <w:tcMar>
+              <w:top w:type="dxa" w:w="80"/>
+              <w:left w:type="dxa" w:w="100"/>
+              <w:bottom w:type="dxa" w:w="80"/>
+              <w:right w:type="dxa" w:w="100"/>
+            </w:tcMar>
+            <w:vAlign w:val="top"/>
+          </w:tcPr>
+          <w:p>
+            <w:pPr>
+              <w:spacing w:after="0" w:before="0" w:line="250"/>
+            </w:pPr>
+            <w:r>
+              <w:rPr>
+                <w:rFonts w:ascii="Calibri" w:cs="Calibri" w:eastAsia="Calibri" w:hAnsi="Calibri"/>
+                <w:b/>
+                <w:bCs/>
+                <w:sz w:val="20"/>
+                <w:szCs w:val="20"/>
+              </w:rPr>
+              <w:t xml:space="preserve">Detail</w:t>
+            </w:r>
+          </w:p>
+        </w:tc>
+      </w:tr>
+      <w:tr>
+        <w:trPr>
+          <w:cantSplit/>
+        </w:trPr>
+        <w:tc>
+          <w:tcPr>
+            <w:tcW w:type="dxa" w:w="2400"/>
+            <w:tcMar>
+              <w:top w:type="dxa" w:w="80"/>
+              <w:left w:type="dxa" w:w="100"/>
+              <w:bottom w:type="dxa" w:w="80"/>
+              <w:right w:type="dxa" w:w="100"/>
+            </w:tcMar>
+            <w:vAlign w:val="top"/>
+          </w:tcPr>
+          <w:p>
+            <w:pPr>
+              <w:spacing w:after="0" w:before="0" w:line="250"/>
+            </w:pPr>
+            <w:r>
+              <w:rPr>
+                <w:rFonts w:ascii="Calibri" w:cs="Calibri" w:eastAsia="Calibri" w:hAnsi="Calibri"/>
+                <w:b w:val="false"/>
+                <w:bCs w:val="false"/>
+                <w:sz w:val="20"/>
+                <w:szCs w:val="20"/>
+              </w:rPr>
+              <w:t xml:space="preserve">Tool</w:t>
+            </w:r>
+          </w:p>
+        </w:tc>
+        <w:tc>
+          <w:tcPr>
+            <w:tcW w:type="dxa" w:w="6960"/>
+            <w:tcMar>
+              <w:top w:type="dxa" w:w="80"/>
+              <w:left w:type="dxa" w:w="100"/>
+              <w:bottom w:type="dxa" w:w="80"/>
+              <w:right w:type="dxa" w:w="100"/>
+            </w:tcMar>
+            <w:vAlign w:val="top"/>
+          </w:tcPr>
+          <w:p>
+            <w:pPr>
+              <w:spacing w:after="0" w:before="0" w:line="250"/>
+            </w:pPr>
+            <w:r>
+              <w:rPr>
+                <w:rFonts w:ascii="Calibri" w:cs="Calibri" w:eastAsia="Calibri" w:hAnsi="Calibri"/>
+                <w:b w:val="false"/>
+                <w:bCs w:val="false"/>
+                <w:sz w:val="20"/>
+                <w:szCs w:val="20"/>
+              </w:rPr>
+              <w:t xml:space="preserve">Claude (Anthropic, Claude Sonnet 5)</w:t>
+            </w:r>
+          </w:p>
+        </w:tc>
+      </w:tr>
+      <w:tr>
+        <w:trPr>
+          <w:cantSplit/>
+        </w:trPr>
+        <w:tc>
+          <w:tcPr>
+            <w:tcW w:type="dxa" w:w="2400"/>
+            <w:tcMar>
+              <w:top w:type="dxa" w:w="80"/>
+              <w:left w:type="dxa" w:w="100"/>
+              <w:bottom w:type="dxa" w:w="80"/>
+              <w:right w:type="dxa" w:w="100"/>
+            </w:tcMar>
+            <w:vAlign w:val="top"/>
+          </w:tcPr>
+          <w:p>
+            <w:pPr>
+              <w:spacing w:after="0" w:before="0" w:line="250"/>
+            </w:pPr>
+            <w:r>
+              <w:rPr>
+                <w:rFonts w:ascii="Calibri" w:cs="Calibri" w:eastAsia="Calibri" w:hAnsi="Calibri"/>
+                <w:b w:val="false"/>
+                <w:bCs w:val="false"/>
+                <w:sz w:val="20"/>
+                <w:szCs w:val="20"/>
+              </w:rPr>
+              <w:t xml:space="preserve">Date / Phase</w:t>
+            </w:r>
+          </w:p>
+        </w:tc>
+        <w:tc>
+          <w:tcPr>
+            <w:tcW w:type="dxa" w:w="6960"/>
+            <w:tcMar>
+              <w:top w:type="dxa" w:w="80"/>
+              <w:left w:type="dxa" w:w="100"/>
+              <w:bottom w:type="dxa" w:w="80"/>
+              <w:right w:type="dxa" w:w="100"/>
+            </w:tcMar>
+            <w:vAlign w:val="top"/>
+          </w:tcPr>
+          <w:p>
+            <w:pPr>
+              <w:spacing w:after="0" w:before="0" w:line="250"/>
+            </w:pPr>
+            <w:r>
+              <w:rPr>
+                <w:rFonts w:ascii="Calibri" w:cs="Calibri" w:eastAsia="Calibri" w:hAnsi="Calibri"/>
+                <w:b w:val="false"/>
+                <w:bCs w:val="false"/>
+                <w:sz w:val="20"/>
+                <w:szCs w:val="20"/>
+              </w:rPr>
+              <w:t xml:space="preserve">Week 4 (2026-09-28), revision after supervisor reply</w:t>
+            </w:r>
+          </w:p>
+        </w:tc>
+      </w:tr>
+      <w:tr>
+        <w:trPr>
+          <w:cantSplit/>
+        </w:trPr>
+        <w:tc>
+          <w:tcPr>
+            <w:tcW w:type="dxa" w:w="2400"/>
+            <w:tcMar>
+              <w:top w:type="dxa" w:w="80"/>
+              <w:left w:type="dxa" w:w="100"/>
+              <w:bottom w:type="dxa" w:w="80"/>
+              <w:right w:type="dxa" w:w="100"/>
+            </w:tcMar>
+            <w:vAlign w:val="top"/>
+          </w:tcPr>
+          <w:p>
+            <w:pPr>
+              <w:spacing w:after="0" w:before="0" w:line="250"/>
+            </w:pPr>
+            <w:r>
+              <w:rPr>
+                <w:rFonts w:ascii="Calibri" w:cs="Calibri" w:eastAsia="Calibri" w:hAnsi="Calibri"/>
+                <w:b w:val="false"/>
+                <w:bCs w:val="false"/>
+                <w:sz w:val="20"/>
+                <w:szCs w:val="20"/>
+              </w:rPr>
+              <w:t xml:space="preserve">Purpose</w:t>
+            </w:r>
+          </w:p>
+        </w:tc>
+        <w:tc>
+          <w:tcPr>
+            <w:tcW w:type="dxa" w:w="6960"/>
+            <w:tcMar>
+              <w:top w:type="dxa" w:w="80"/>
+              <w:left w:type="dxa" w:w="100"/>
+              <w:bottom w:type="dxa" w:w="80"/>
+              <w:right w:type="dxa" w:w="100"/>
+            </w:tcMar>
+            <w:vAlign w:val="top"/>
+          </w:tcPr>
+          <w:p>
+            <w:pPr>
+              <w:spacing w:after="0" w:before="0" w:line="250"/>
+            </w:pPr>
+            <w:r>
+              <w:rPr>
+                <w:rFonts w:ascii="Calibri" w:cs="Calibri" w:eastAsia="Calibri" w:hAnsi="Calibri"/>
+                <w:b w:val="false"/>
+                <w:bCs w:val="false"/>
+                <w:sz w:val="20"/>
+                <w:szCs w:val="20"/>
+              </w:rPr>
+              <w:t xml:space="preserve">Read the supervisor's actual reply to the two emailed requests and revise the design and Section 11 to act on it, rather than only disclosing that a reply was expected.</w:t>
+            </w:r>
+          </w:p>
+        </w:tc>
+      </w:tr>
+      <w:tr>
+        <w:trPr>
+          <w:cantSplit/>
+        </w:trPr>
+        <w:tc>
+          <w:tcPr>
+            <w:tcW w:type="dxa" w:w="2400"/>
+            <w:tcMar>
+              <w:top w:type="dxa" w:w="80"/>
+              <w:left w:type="dxa" w:w="100"/>
+              <w:bottom w:type="dxa" w:w="80"/>
+              <w:right w:type="dxa" w:w="100"/>
+            </w:tcMar>
+            <w:vAlign w:val="top"/>
+          </w:tcPr>
+          <w:p>
+            <w:pPr>
+              <w:spacing w:after="0" w:before="0" w:line="250"/>
+            </w:pPr>
+            <w:r>
+              <w:rPr>
+                <w:rFonts w:ascii="Calibri" w:cs="Calibri" w:eastAsia="Calibri" w:hAnsi="Calibri"/>
+                <w:b w:val="false"/>
+                <w:bCs w:val="false"/>
+                <w:sz w:val="20"/>
+                <w:szCs w:val="20"/>
+              </w:rPr>
+              <w:t xml:space="preserve">Prompt / Task Summary</w:t>
+            </w:r>
+          </w:p>
+        </w:tc>
+        <w:tc>
+          <w:tcPr>
+            <w:tcW w:type="dxa" w:w="6960"/>
+            <w:tcMar>
+              <w:top w:type="dxa" w:w="80"/>
+              <w:left w:type="dxa" w:w="100"/>
+              <w:bottom w:type="dxa" w:w="80"/>
+              <w:right w:type="dxa" w:w="100"/>
+            </w:tcMar>
+            <w:vAlign w:val="top"/>
+          </w:tcPr>
+          <w:p>
+            <w:pPr>
+              <w:spacing w:after="0" w:before="0" w:line="250"/>
+            </w:pPr>
+            <w:r>
+              <w:rPr>
+                <w:rFonts w:ascii="Calibri" w:cs="Calibri" w:eastAsia="Calibri" w:hAnsi="Calibri"/>
+                <w:b w:val="false"/>
+                <w:bCs w:val="false"/>
+                <w:sz w:val="20"/>
+                <w:szCs w:val="20"/>
+              </w:rPr>
+              <w:t xml:space="preserve">Open and quote the supervisor's Sep 27, 8:59 PM EDT reply approving the three-archetype approach and requiring the blend to be explicit about being deterministic, documented, and reproducible; add that explicit statement to Section 5.3; update Section 11 with the quoted response and what was and was not directly addressed; note the class-wide deadline extension to Sep 29 and that this revision is being made to act on the response, not merely to use extra time.</w:t>
+            </w:r>
+          </w:p>
+        </w:tc>
+      </w:tr>
+      <w:tr>
+        <w:trPr>
+          <w:cantSplit/>
+        </w:trPr>
+        <w:tc>
+          <w:tcPr>
+            <w:tcW w:type="dxa" w:w="2400"/>
+            <w:tcMar>
+              <w:top w:type="dxa" w:w="80"/>
+              <w:left w:type="dxa" w:w="100"/>
+              <w:bottom w:type="dxa" w:w="80"/>
+              <w:right w:type="dxa" w:w="100"/>
+            </w:tcMar>
+            <w:vAlign w:val="top"/>
+          </w:tcPr>
+          <w:p>
+            <w:pPr>
+              <w:spacing w:after="0" w:before="0" w:line="250"/>
+            </w:pPr>
+            <w:r>
+              <w:rPr>
+                <w:rFonts w:ascii="Calibri" w:cs="Calibri" w:eastAsia="Calibri" w:hAnsi="Calibri"/>
+                <w:b w:val="false"/>
+                <w:bCs w:val="false"/>
+                <w:sz w:val="20"/>
+                <w:szCs w:val="20"/>
+              </w:rPr>
+              <w:t xml:space="preserve">Output Used</w:t>
+            </w:r>
+          </w:p>
+        </w:tc>
+        <w:tc>
+          <w:tcPr>
+            <w:tcW w:type="dxa" w:w="6960"/>
+            <w:tcMar>
+              <w:top w:type="dxa" w:w="80"/>
+              <w:left w:type="dxa" w:w="100"/>
+              <w:bottom w:type="dxa" w:w="80"/>
+              <w:right w:type="dxa" w:w="100"/>
+            </w:tcMar>
+            <w:vAlign w:val="top"/>
+          </w:tcPr>
+          <w:p>
+            <w:pPr>
+              <w:spacing w:after="0" w:before="0" w:line="250"/>
+            </w:pPr>
+            <w:r>
+              <w:rPr>
+                <w:rFonts w:ascii="Calibri" w:cs="Calibri" w:eastAsia="Calibri" w:hAnsi="Calibri"/>
+                <w:b w:val="false"/>
+                <w:bCs w:val="false"/>
+                <w:sz w:val="20"/>
+                <w:szCs w:val="20"/>
+              </w:rPr>
+              <w:t xml:space="preserve">Revised Sections 5.3 and 11 of the Design Review Package.</w:t>
+            </w:r>
+          </w:p>
+        </w:tc>
+      </w:tr>
+      <w:tr>
+        <w:trPr>
+          <w:cantSplit/>
+        </w:trPr>
+        <w:tc>
+          <w:tcPr>
+            <w:tcW w:type="dxa" w:w="2400"/>
+            <w:tcMar>
+              <w:top w:type="dxa" w:w="80"/>
+              <w:left w:type="dxa" w:w="100"/>
+              <w:bottom w:type="dxa" w:w="80"/>
+              <w:right w:type="dxa" w:w="100"/>
+            </w:tcMar>
+            <w:vAlign w:val="top"/>
+          </w:tcPr>
+          <w:p>
+            <w:pPr>
+              <w:spacing w:after="0" w:before="0" w:line="250"/>
+            </w:pPr>
+            <w:r>
+              <w:rPr>
+                <w:rFonts w:ascii="Calibri" w:cs="Calibri" w:eastAsia="Calibri" w:hAnsi="Calibri"/>
+                <w:b w:val="false"/>
+                <w:bCs w:val="false"/>
+                <w:sz w:val="20"/>
+                <w:szCs w:val="20"/>
+              </w:rPr>
+              <w:t xml:space="preserve">Affected Section / Artifact</w:t>
+            </w:r>
+          </w:p>
+        </w:tc>
+        <w:tc>
+          <w:tcPr>
+            <w:tcW w:type="dxa" w:w="6960"/>
+            <w:tcMar>
+              <w:top w:type="dxa" w:w="80"/>
+              <w:left w:type="dxa" w:w="100"/>
+              <w:bottom w:type="dxa" w:w="80"/>
+              <w:right w:type="dxa" w:w="100"/>
+            </w:tcMar>
+            <w:vAlign w:val="top"/>
+          </w:tcPr>
+          <w:p>
+            <w:pPr>
+              <w:spacing w:after="0" w:before="0" w:line="250"/>
+            </w:pPr>
+            <w:r>
+              <w:rPr>
+                <w:rFonts w:ascii="Calibri" w:cs="Calibri" w:eastAsia="Calibri" w:hAnsi="Calibri"/>
+                <w:b w:val="false"/>
+                <w:bCs w:val="false"/>
+                <w:sz w:val="20"/>
+                <w:szCs w:val="20"/>
+              </w:rPr>
+              <w:t xml:space="preserve">Sections 5.3, 11.</w:t>
+            </w:r>
+          </w:p>
+        </w:tc>
+      </w:tr>
+      <w:tr>
+        <w:trPr>
+          <w:cantSplit/>
+        </w:trPr>
+        <w:tc>
+          <w:tcPr>
+            <w:tcW w:type="dxa" w:w="2400"/>
+            <w:tcMar>
+              <w:top w:type="dxa" w:w="80"/>
+              <w:left w:type="dxa" w:w="100"/>
+              <w:bottom w:type="dxa" w:w="80"/>
+              <w:right w:type="dxa" w:w="100"/>
+            </w:tcMar>
+            <w:vAlign w:val="top"/>
+          </w:tcPr>
+          <w:p>
+            <w:pPr>
+              <w:spacing w:after="0" w:before="0" w:line="250"/>
+            </w:pPr>
+            <w:r>
+              <w:rPr>
+                <w:rFonts w:ascii="Calibri" w:cs="Calibri" w:eastAsia="Calibri" w:hAnsi="Calibri"/>
+                <w:b w:val="false"/>
+                <w:bCs w:val="false"/>
+                <w:sz w:val="20"/>
+                <w:szCs w:val="20"/>
+              </w:rPr>
+              <w:t xml:space="preserve">Human Verification</w:t>
+            </w:r>
+          </w:p>
+        </w:tc>
+        <w:tc>
+          <w:tcPr>
+            <w:tcW w:type="dxa" w:w="6960"/>
+            <w:tcMar>
+              <w:top w:type="dxa" w:w="80"/>
+              <w:left w:type="dxa" w:w="100"/>
+              <w:bottom w:type="dxa" w:w="80"/>
+              <w:right w:type="dxa" w:w="100"/>
+            </w:tcMar>
+            <w:vAlign w:val="top"/>
+          </w:tcPr>
+          <w:p>
+            <w:pPr>
+              <w:spacing w:after="0" w:before="0" w:line="250"/>
+            </w:pPr>
+            <w:r>
+              <w:rPr>
+                <w:rFonts w:ascii="Calibri" w:cs="Calibri" w:eastAsia="Calibri" w:hAnsi="Calibri"/>
+                <w:b w:val="false"/>
+                <w:bCs w:val="false"/>
+                <w:sz w:val="20"/>
+                <w:szCs w:val="20"/>
+              </w:rPr>
+              <w:t xml:space="preserve">The quoted reply was read directly from Outlook, not paraphrased from memory; the Canvas assignment page was checked directly for the real extended availability date (Sep 29, 11:59 PM) rather than computing it from the announcement's "two days" wording alone.</w:t>
+            </w:r>
+          </w:p>
+        </w:tc>
+      </w:tr>
+      <w:tr>
+        <w:trPr>
+          <w:cantSplit/>
+        </w:trPr>
+        <w:tc>
+          <w:tcPr>
+            <w:tcW w:type="dxa" w:w="2400"/>
+            <w:tcMar>
+              <w:top w:type="dxa" w:w="80"/>
+              <w:left w:type="dxa" w:w="100"/>
+              <w:bottom w:type="dxa" w:w="80"/>
+              <w:right w:type="dxa" w:w="100"/>
+            </w:tcMar>
+            <w:vAlign w:val="top"/>
+          </w:tcPr>
+          <w:p>
+            <w:pPr>
+              <w:spacing w:after="0" w:before="0" w:line="250"/>
+            </w:pPr>
+            <w:r>
+              <w:rPr>
+                <w:rFonts w:ascii="Calibri" w:cs="Calibri" w:eastAsia="Calibri" w:hAnsi="Calibri"/>
+                <w:b w:val="false"/>
+                <w:bCs w:val="false"/>
+                <w:sz w:val="20"/>
+                <w:szCs w:val="20"/>
+              </w:rPr>
+              <w:t xml:space="preserve">Final Student Revisions</w:t>
+            </w:r>
+          </w:p>
+        </w:tc>
+        <w:tc>
+          <w:tcPr>
+            <w:tcW w:type="dxa" w:w="6960"/>
+            <w:tcMar>
+              <w:top w:type="dxa" w:w="80"/>
+              <w:left w:type="dxa" w:w="100"/>
+              <w:bottom w:type="dxa" w:w="80"/>
+              <w:right w:type="dxa" w:w="100"/>
+            </w:tcMar>
+            <w:vAlign w:val="top"/>
+          </w:tcPr>
+          <w:p>
+            <w:pPr>
+              <w:spacing w:after="0" w:before="0" w:line="250"/>
+            </w:pPr>
+            <w:r>
+              <w:rPr>
+                <w:rFonts w:ascii="Calibri" w:cs="Calibri" w:eastAsia="Calibri" w:hAnsi="Calibri"/>
+                <w:b w:val="false"/>
+                <w:bCs w:val="false"/>
+                <w:sz w:val="20"/>
+                <w:szCs w:val="20"/>
+              </w:rPr>
+              <w:t xml:space="preserve">Student decided that the second-judge and evidence-base questions, not directly addressed in the reply, would be treated as resolved by proceeding rather than re-asked, consistent with the decision to stop emailing and document instead.</w:t>
             </w:r>
           </w:p>
         </w:tc>

</xml_diff>

<commit_message>
Hard Stop 2: add the fairness-by-shelter-characteristic check (Week 2 feedback, second half)
Week 2 feedback named two checks under 'sensitivity/fairness': AHP-judgment
robustness (already built) and whether scoring favors a shelter characteristic
regardless of case merit (missing). Adds a won-share-vs-eligible-share method
by tier, vet availability, distance, and data freshness, honestly caveated as
directional given only 9 planned cases. Traceability row NFR7; Week 7 build
step updated; AI_USE_LOG.md Entry 17.

Co-Authored-By: Claude Sonnet 5 <noreply@anthropic.com>
</commit_message>
<xml_diff>
--- a/docs/CISC699_HardStop2_DesignReview.docx
+++ b/docs/CISC699_HardStop2_DesignReview.docx
@@ -3684,6 +3684,588 @@
                 <w:szCs w:val="20"/>
               </w:rPr>
               <w:t xml:space="preserve">Student decided that the second-judge and evidence-base questions, not directly addressed in the reply, would be treated as resolved by proceeding rather than re-asked, consistent with the decision to stop emailing and document instead.</w:t>
+            </w:r>
+          </w:p>
+        </w:tc>
+      </w:tr>
+    </w:tbl>
+    <w:p>
+      <w:pPr>
+        <w:spacing w:after="0" w:before="0" w:line="264"/>
+      </w:pPr>
+      <w:r>
+        <w:rPr>
+          <w:rFonts w:ascii="Calibri" w:cs="Calibri" w:eastAsia="Calibri" w:hAnsi="Calibri"/>
+          <w:sz w:val="22"/>
+          <w:szCs w:val="22"/>
+        </w:rPr>
+        <w:t xml:space="preserve"/>
+      </w:r>
+    </w:p>
+    <w:p>
+      <w:pPr>
+        <w:keepNext/>
+        <w:spacing w:after="60" w:before="120" w:line="264"/>
+      </w:pPr>
+      <w:r>
+        <w:rPr>
+          <w:rFonts w:ascii="Calibri" w:cs="Calibri" w:eastAsia="Calibri" w:hAnsi="Calibri"/>
+          <w:b/>
+          <w:bCs/>
+          <w:i/>
+          <w:iCs/>
+          <w:sz w:val="22"/>
+          <w:szCs w:val="22"/>
+        </w:rPr>
+        <w:t xml:space="preserve">Entry 17 — Fairness-by-Shelter-Characteristic Check</w:t>
+      </w:r>
+    </w:p>
+    <w:tbl>
+      <w:tblPr>
+        <w:tblW w:type="dxa" w:w="9360"/>
+        <w:tblBorders>
+          <w:top w:val="single" w:color="999999" w:sz="4"/>
+          <w:left w:val="single" w:color="999999" w:sz="4"/>
+          <w:bottom w:val="single" w:color="999999" w:sz="4"/>
+          <w:right w:val="single" w:color="999999" w:sz="4"/>
+          <w:insideH w:val="single" w:color="CCCCCC" w:sz="2"/>
+          <w:insideV w:val="single" w:color="CCCCCC" w:sz="2"/>
+        </w:tblBorders>
+      </w:tblPr>
+      <w:tblGrid>
+        <w:gridCol w:w="2400"/>
+        <w:gridCol w:w="6960"/>
+      </w:tblGrid>
+      <w:tr>
+        <w:trPr>
+          <w:cantSplit/>
+          <w:tblHeader/>
+        </w:trPr>
+        <w:tc>
+          <w:tcPr>
+            <w:tcW w:type="dxa" w:w="2400"/>
+            <w:shd w:fill="E8F3EF" w:val="clear"/>
+            <w:tcMar>
+              <w:top w:type="dxa" w:w="80"/>
+              <w:left w:type="dxa" w:w="100"/>
+              <w:bottom w:type="dxa" w:w="80"/>
+              <w:right w:type="dxa" w:w="100"/>
+            </w:tcMar>
+            <w:vAlign w:val="top"/>
+          </w:tcPr>
+          <w:p>
+            <w:pPr>
+              <w:spacing w:after="0" w:before="0" w:line="250"/>
+            </w:pPr>
+            <w:r>
+              <w:rPr>
+                <w:rFonts w:ascii="Calibri" w:cs="Calibri" w:eastAsia="Calibri" w:hAnsi="Calibri"/>
+                <w:b/>
+                <w:bCs/>
+                <w:sz w:val="20"/>
+                <w:szCs w:val="20"/>
+              </w:rPr>
+              <w:t xml:space="preserve">Field</w:t>
+            </w:r>
+          </w:p>
+        </w:tc>
+        <w:tc>
+          <w:tcPr>
+            <w:tcW w:type="dxa" w:w="6960"/>
+            <w:shd w:fill="E8F3EF" w:val="clear"/>
+            <w:tcMar>
+              <w:top w:type="dxa" w:w="80"/>
+              <w:left w:type="dxa" w:w="100"/>
+              <w:bottom w:type="dxa" w:w="80"/>
+              <w:right w:type="dxa" w:w="100"/>
+            </w:tcMar>
+            <w:vAlign w:val="top"/>
+          </w:tcPr>
+          <w:p>
+            <w:pPr>
+              <w:spacing w:after="0" w:before="0" w:line="250"/>
+            </w:pPr>
+            <w:r>
+              <w:rPr>
+                <w:rFonts w:ascii="Calibri" w:cs="Calibri" w:eastAsia="Calibri" w:hAnsi="Calibri"/>
+                <w:b/>
+                <w:bCs/>
+                <w:sz w:val="20"/>
+                <w:szCs w:val="20"/>
+              </w:rPr>
+              <w:t xml:space="preserve">Detail</w:t>
+            </w:r>
+          </w:p>
+        </w:tc>
+      </w:tr>
+      <w:tr>
+        <w:trPr>
+          <w:cantSplit/>
+        </w:trPr>
+        <w:tc>
+          <w:tcPr>
+            <w:tcW w:type="dxa" w:w="2400"/>
+            <w:tcMar>
+              <w:top w:type="dxa" w:w="80"/>
+              <w:left w:type="dxa" w:w="100"/>
+              <w:bottom w:type="dxa" w:w="80"/>
+              <w:right w:type="dxa" w:w="100"/>
+            </w:tcMar>
+            <w:vAlign w:val="top"/>
+          </w:tcPr>
+          <w:p>
+            <w:pPr>
+              <w:spacing w:after="0" w:before="0" w:line="250"/>
+            </w:pPr>
+            <w:r>
+              <w:rPr>
+                <w:rFonts w:ascii="Calibri" w:cs="Calibri" w:eastAsia="Calibri" w:hAnsi="Calibri"/>
+                <w:b w:val="false"/>
+                <w:bCs w:val="false"/>
+                <w:sz w:val="20"/>
+                <w:szCs w:val="20"/>
+              </w:rPr>
+              <w:t xml:space="preserve">Tool</w:t>
+            </w:r>
+          </w:p>
+        </w:tc>
+        <w:tc>
+          <w:tcPr>
+            <w:tcW w:type="dxa" w:w="6960"/>
+            <w:tcMar>
+              <w:top w:type="dxa" w:w="80"/>
+              <w:left w:type="dxa" w:w="100"/>
+              <w:bottom w:type="dxa" w:w="80"/>
+              <w:right w:type="dxa" w:w="100"/>
+            </w:tcMar>
+            <w:vAlign w:val="top"/>
+          </w:tcPr>
+          <w:p>
+            <w:pPr>
+              <w:spacing w:after="0" w:before="0" w:line="250"/>
+            </w:pPr>
+            <w:r>
+              <w:rPr>
+                <w:rFonts w:ascii="Calibri" w:cs="Calibri" w:eastAsia="Calibri" w:hAnsi="Calibri"/>
+                <w:b w:val="false"/>
+                <w:bCs w:val="false"/>
+                <w:sz w:val="20"/>
+                <w:szCs w:val="20"/>
+              </w:rPr>
+              <w:t xml:space="preserve">Claude (Anthropic, Claude Sonnet 5)</w:t>
+            </w:r>
+          </w:p>
+        </w:tc>
+      </w:tr>
+      <w:tr>
+        <w:trPr>
+          <w:cantSplit/>
+        </w:trPr>
+        <w:tc>
+          <w:tcPr>
+            <w:tcW w:type="dxa" w:w="2400"/>
+            <w:tcMar>
+              <w:top w:type="dxa" w:w="80"/>
+              <w:left w:type="dxa" w:w="100"/>
+              <w:bottom w:type="dxa" w:w="80"/>
+              <w:right w:type="dxa" w:w="100"/>
+            </w:tcMar>
+            <w:vAlign w:val="top"/>
+          </w:tcPr>
+          <w:p>
+            <w:pPr>
+              <w:spacing w:after="0" w:before="0" w:line="250"/>
+            </w:pPr>
+            <w:r>
+              <w:rPr>
+                <w:rFonts w:ascii="Calibri" w:cs="Calibri" w:eastAsia="Calibri" w:hAnsi="Calibri"/>
+                <w:b w:val="false"/>
+                <w:bCs w:val="false"/>
+                <w:sz w:val="20"/>
+                <w:szCs w:val="20"/>
+              </w:rPr>
+              <w:t xml:space="preserve">Date / Phase</w:t>
+            </w:r>
+          </w:p>
+        </w:tc>
+        <w:tc>
+          <w:tcPr>
+            <w:tcW w:type="dxa" w:w="6960"/>
+            <w:tcMar>
+              <w:top w:type="dxa" w:w="80"/>
+              <w:left w:type="dxa" w:w="100"/>
+              <w:bottom w:type="dxa" w:w="80"/>
+              <w:right w:type="dxa" w:w="100"/>
+            </w:tcMar>
+            <w:vAlign w:val="top"/>
+          </w:tcPr>
+          <w:p>
+            <w:pPr>
+              <w:spacing w:after="0" w:before="0" w:line="250"/>
+            </w:pPr>
+            <w:r>
+              <w:rPr>
+                <w:rFonts w:ascii="Calibri" w:cs="Calibri" w:eastAsia="Calibri" w:hAnsi="Calibri"/>
+                <w:b w:val="false"/>
+                <w:bCs w:val="false"/>
+                <w:sz w:val="20"/>
+                <w:szCs w:val="20"/>
+              </w:rPr>
+              <w:t xml:space="preserve">Week 4 (2026-09-29), addition before resubmission</w:t>
+            </w:r>
+          </w:p>
+        </w:tc>
+      </w:tr>
+      <w:tr>
+        <w:trPr>
+          <w:cantSplit/>
+        </w:trPr>
+        <w:tc>
+          <w:tcPr>
+            <w:tcW w:type="dxa" w:w="2400"/>
+            <w:tcMar>
+              <w:top w:type="dxa" w:w="80"/>
+              <w:left w:type="dxa" w:w="100"/>
+              <w:bottom w:type="dxa" w:w="80"/>
+              <w:right w:type="dxa" w:w="100"/>
+            </w:tcMar>
+            <w:vAlign w:val="top"/>
+          </w:tcPr>
+          <w:p>
+            <w:pPr>
+              <w:spacing w:after="0" w:before="0" w:line="250"/>
+            </w:pPr>
+            <w:r>
+              <w:rPr>
+                <w:rFonts w:ascii="Calibri" w:cs="Calibri" w:eastAsia="Calibri" w:hAnsi="Calibri"/>
+                <w:b w:val="false"/>
+                <w:bCs w:val="false"/>
+                <w:sz w:val="20"/>
+                <w:szCs w:val="20"/>
+              </w:rPr>
+              <w:t xml:space="preserve">Purpose</w:t>
+            </w:r>
+          </w:p>
+        </w:tc>
+        <w:tc>
+          <w:tcPr>
+            <w:tcW w:type="dxa" w:w="6960"/>
+            <w:tcMar>
+              <w:top w:type="dxa" w:w="80"/>
+              <w:left w:type="dxa" w:w="100"/>
+              <w:bottom w:type="dxa" w:w="80"/>
+              <w:right w:type="dxa" w:w="100"/>
+            </w:tcMar>
+            <w:vAlign w:val="top"/>
+          </w:tcPr>
+          <w:p>
+            <w:pPr>
+              <w:spacing w:after="0" w:before="0" w:line="250"/>
+            </w:pPr>
+            <w:r>
+              <w:rPr>
+                <w:rFonts w:ascii="Calibri" w:cs="Calibri" w:eastAsia="Calibri" w:hAnsi="Calibri"/>
+                <w:b w:val="false"/>
+                <w:bCs w:val="false"/>
+                <w:sz w:val="20"/>
+                <w:szCs w:val="20"/>
+              </w:rPr>
+              <w:t xml:space="preserve">Add the second half of the Week 2 fairness/sensitivity request, which the sensitivity check alone did not cover: whether scoring systematically favors a shelter characteristic regardless of case merit.</w:t>
+            </w:r>
+          </w:p>
+        </w:tc>
+      </w:tr>
+      <w:tr>
+        <w:trPr>
+          <w:cantSplit/>
+        </w:trPr>
+        <w:tc>
+          <w:tcPr>
+            <w:tcW w:type="dxa" w:w="2400"/>
+            <w:tcMar>
+              <w:top w:type="dxa" w:w="80"/>
+              <w:left w:type="dxa" w:w="100"/>
+              <w:bottom w:type="dxa" w:w="80"/>
+              <w:right w:type="dxa" w:w="100"/>
+            </w:tcMar>
+            <w:vAlign w:val="top"/>
+          </w:tcPr>
+          <w:p>
+            <w:pPr>
+              <w:spacing w:after="0" w:before="0" w:line="250"/>
+            </w:pPr>
+            <w:r>
+              <w:rPr>
+                <w:rFonts w:ascii="Calibri" w:cs="Calibri" w:eastAsia="Calibri" w:hAnsi="Calibri"/>
+                <w:b w:val="false"/>
+                <w:bCs w:val="false"/>
+                <w:sz w:val="20"/>
+                <w:szCs w:val="20"/>
+              </w:rPr>
+              <w:t xml:space="preserve">Prompt / Task Summary</w:t>
+            </w:r>
+          </w:p>
+        </w:tc>
+        <w:tc>
+          <w:tcPr>
+            <w:tcW w:type="dxa" w:w="6960"/>
+            <w:tcMar>
+              <w:top w:type="dxa" w:w="80"/>
+              <w:left w:type="dxa" w:w="100"/>
+              <w:bottom w:type="dxa" w:w="80"/>
+              <w:right w:type="dxa" w:w="100"/>
+            </w:tcMar>
+            <w:vAlign w:val="top"/>
+          </w:tcPr>
+          <w:p>
+            <w:pPr>
+              <w:spacing w:after="0" w:before="0" w:line="250"/>
+            </w:pPr>
+            <w:r>
+              <w:rPr>
+                <w:rFonts w:ascii="Calibri" w:cs="Calibri" w:eastAsia="Calibri" w:hAnsi="Calibri"/>
+                <w:b w:val="false"/>
+                <w:bCs w:val="false"/>
+                <w:sz w:val="20"/>
+                <w:szCs w:val="20"/>
+              </w:rPr>
+              <w:t xml:space="preserve">Re-read the exact Week 2 feedback wording to separate its two asks (judgment sensitivity vs. input-factor fairness); design a won-share-vs-eligible-share method by shelter characteristic (tier, vet availability, distance, freshness); add it to Section 8 with an honest statistical-power caveat given only 9 planned cases; add a traceability row and a Week 7 build-order update.</w:t>
+            </w:r>
+          </w:p>
+        </w:tc>
+      </w:tr>
+      <w:tr>
+        <w:trPr>
+          <w:cantSplit/>
+        </w:trPr>
+        <w:tc>
+          <w:tcPr>
+            <w:tcW w:type="dxa" w:w="2400"/>
+            <w:tcMar>
+              <w:top w:type="dxa" w:w="80"/>
+              <w:left w:type="dxa" w:w="100"/>
+              <w:bottom w:type="dxa" w:w="80"/>
+              <w:right w:type="dxa" w:w="100"/>
+            </w:tcMar>
+            <w:vAlign w:val="top"/>
+          </w:tcPr>
+          <w:p>
+            <w:pPr>
+              <w:spacing w:after="0" w:before="0" w:line="250"/>
+            </w:pPr>
+            <w:r>
+              <w:rPr>
+                <w:rFonts w:ascii="Calibri" w:cs="Calibri" w:eastAsia="Calibri" w:hAnsi="Calibri"/>
+                <w:b w:val="false"/>
+                <w:bCs w:val="false"/>
+                <w:sz w:val="20"/>
+                <w:szCs w:val="20"/>
+              </w:rPr>
+              <w:t xml:space="preserve">Output Used</w:t>
+            </w:r>
+          </w:p>
+        </w:tc>
+        <w:tc>
+          <w:tcPr>
+            <w:tcW w:type="dxa" w:w="6960"/>
+            <w:tcMar>
+              <w:top w:type="dxa" w:w="80"/>
+              <w:left w:type="dxa" w:w="100"/>
+              <w:bottom w:type="dxa" w:w="80"/>
+              <w:right w:type="dxa" w:w="100"/>
+            </w:tcMar>
+            <w:vAlign w:val="top"/>
+          </w:tcPr>
+          <w:p>
+            <w:pPr>
+              <w:spacing w:after="0" w:before="0" w:line="250"/>
+            </w:pPr>
+            <w:r>
+              <w:rPr>
+                <w:rFonts w:ascii="Calibri" w:cs="Calibri" w:eastAsia="Calibri" w:hAnsi="Calibri"/>
+                <w:b w:val="false"/>
+                <w:bCs w:val="false"/>
+                <w:sz w:val="20"/>
+                <w:szCs w:val="20"/>
+              </w:rPr>
+              <w:t xml:space="preserve">New Section 8 subsection, Section 9 row NFR7, Section 11 Week 7 build step.</w:t>
+            </w:r>
+          </w:p>
+        </w:tc>
+      </w:tr>
+      <w:tr>
+        <w:trPr>
+          <w:cantSplit/>
+        </w:trPr>
+        <w:tc>
+          <w:tcPr>
+            <w:tcW w:type="dxa" w:w="2400"/>
+            <w:tcMar>
+              <w:top w:type="dxa" w:w="80"/>
+              <w:left w:type="dxa" w:w="100"/>
+              <w:bottom w:type="dxa" w:w="80"/>
+              <w:right w:type="dxa" w:w="100"/>
+            </w:tcMar>
+            <w:vAlign w:val="top"/>
+          </w:tcPr>
+          <w:p>
+            <w:pPr>
+              <w:spacing w:after="0" w:before="0" w:line="250"/>
+            </w:pPr>
+            <w:r>
+              <w:rPr>
+                <w:rFonts w:ascii="Calibri" w:cs="Calibri" w:eastAsia="Calibri" w:hAnsi="Calibri"/>
+                <w:b w:val="false"/>
+                <w:bCs w:val="false"/>
+                <w:sz w:val="20"/>
+                <w:szCs w:val="20"/>
+              </w:rPr>
+              <w:t xml:space="preserve">Affected Section / Artifact</w:t>
+            </w:r>
+          </w:p>
+        </w:tc>
+        <w:tc>
+          <w:tcPr>
+            <w:tcW w:type="dxa" w:w="6960"/>
+            <w:tcMar>
+              <w:top w:type="dxa" w:w="80"/>
+              <w:left w:type="dxa" w:w="100"/>
+              <w:bottom w:type="dxa" w:w="80"/>
+              <w:right w:type="dxa" w:w="100"/>
+            </w:tcMar>
+            <w:vAlign w:val="top"/>
+          </w:tcPr>
+          <w:p>
+            <w:pPr>
+              <w:spacing w:after="0" w:before="0" w:line="250"/>
+            </w:pPr>
+            <w:r>
+              <w:rPr>
+                <w:rFonts w:ascii="Calibri" w:cs="Calibri" w:eastAsia="Calibri" w:hAnsi="Calibri"/>
+                <w:b w:val="false"/>
+                <w:bCs w:val="false"/>
+                <w:sz w:val="20"/>
+                <w:szCs w:val="20"/>
+              </w:rPr>
+              <w:t xml:space="preserve">Sections 8, 9, 11.</w:t>
+            </w:r>
+          </w:p>
+        </w:tc>
+      </w:tr>
+      <w:tr>
+        <w:trPr>
+          <w:cantSplit/>
+        </w:trPr>
+        <w:tc>
+          <w:tcPr>
+            <w:tcW w:type="dxa" w:w="2400"/>
+            <w:tcMar>
+              <w:top w:type="dxa" w:w="80"/>
+              <w:left w:type="dxa" w:w="100"/>
+              <w:bottom w:type="dxa" w:w="80"/>
+              <w:right w:type="dxa" w:w="100"/>
+            </w:tcMar>
+            <w:vAlign w:val="top"/>
+          </w:tcPr>
+          <w:p>
+            <w:pPr>
+              <w:spacing w:after="0" w:before="0" w:line="250"/>
+            </w:pPr>
+            <w:r>
+              <w:rPr>
+                <w:rFonts w:ascii="Calibri" w:cs="Calibri" w:eastAsia="Calibri" w:hAnsi="Calibri"/>
+                <w:b w:val="false"/>
+                <w:bCs w:val="false"/>
+                <w:sz w:val="20"/>
+                <w:szCs w:val="20"/>
+              </w:rPr>
+              <w:t xml:space="preserve">Human Verification</w:t>
+            </w:r>
+          </w:p>
+        </w:tc>
+        <w:tc>
+          <w:tcPr>
+            <w:tcW w:type="dxa" w:w="6960"/>
+            <w:tcMar>
+              <w:top w:type="dxa" w:w="80"/>
+              <w:left w:type="dxa" w:w="100"/>
+              <w:bottom w:type="dxa" w:w="80"/>
+              <w:right w:type="dxa" w:w="100"/>
+            </w:tcMar>
+            <w:vAlign w:val="top"/>
+          </w:tcPr>
+          <w:p>
+            <w:pPr>
+              <w:spacing w:after="0" w:before="0" w:line="250"/>
+            </w:pPr>
+            <w:r>
+              <w:rPr>
+                <w:rFonts w:ascii="Calibri" w:cs="Calibri" w:eastAsia="Calibri" w:hAnsi="Calibri"/>
+                <w:b w:val="false"/>
+                <w:bCs w:val="false"/>
+                <w:sz w:val="20"/>
+                <w:szCs w:val="20"/>
+              </w:rPr>
+              <w:t xml:space="preserve">The Week 2 feedback text was re-read verbatim rather than paraphrased from memory to confirm it named two distinct checks, not one.</w:t>
+            </w:r>
+          </w:p>
+        </w:tc>
+      </w:tr>
+      <w:tr>
+        <w:trPr>
+          <w:cantSplit/>
+        </w:trPr>
+        <w:tc>
+          <w:tcPr>
+            <w:tcW w:type="dxa" w:w="2400"/>
+            <w:tcMar>
+              <w:top w:type="dxa" w:w="80"/>
+              <w:left w:type="dxa" w:w="100"/>
+              <w:bottom w:type="dxa" w:w="80"/>
+              <w:right w:type="dxa" w:w="100"/>
+            </w:tcMar>
+            <w:vAlign w:val="top"/>
+          </w:tcPr>
+          <w:p>
+            <w:pPr>
+              <w:spacing w:after="0" w:before="0" w:line="250"/>
+            </w:pPr>
+            <w:r>
+              <w:rPr>
+                <w:rFonts w:ascii="Calibri" w:cs="Calibri" w:eastAsia="Calibri" w:hAnsi="Calibri"/>
+                <w:b w:val="false"/>
+                <w:bCs w:val="false"/>
+                <w:sz w:val="20"/>
+                <w:szCs w:val="20"/>
+              </w:rPr>
+              <w:t xml:space="preserve">Final Student Revisions</w:t>
+            </w:r>
+          </w:p>
+        </w:tc>
+        <w:tc>
+          <w:tcPr>
+            <w:tcW w:type="dxa" w:w="6960"/>
+            <w:tcMar>
+              <w:top w:type="dxa" w:w="80"/>
+              <w:left w:type="dxa" w:w="100"/>
+              <w:bottom w:type="dxa" w:w="80"/>
+              <w:right w:type="dxa" w:w="100"/>
+            </w:tcMar>
+            <w:vAlign w:val="top"/>
+          </w:tcPr>
+          <w:p>
+            <w:pPr>
+              <w:spacing w:after="0" w:before="0" w:line="250"/>
+            </w:pPr>
+            <w:r>
+              <w:rPr>
+                <w:rFonts w:ascii="Calibri" w:cs="Calibri" w:eastAsia="Calibri" w:hAnsi="Calibri"/>
+                <w:b w:val="false"/>
+                <w:bCs w:val="false"/>
+                <w:sz w:val="20"/>
+                <w:szCs w:val="20"/>
+              </w:rPr>
+              <w:t xml:space="preserve">Student requested this addition given the extended deadline; the specific characteristics checked and the "reported as counts, not percentages" honesty framing were directed by the student.</w:t>
             </w:r>
           </w:p>
         </w:tc>
@@ -16781,7 +17363,531 @@
           <w:sz w:val="22"/>
           <w:szCs w:val="22"/>
         </w:rPr>
-        <w:t xml:space="preserve">The harness logs which weight factor decides the winner in each case. If one factor (for example proximity) decides nearly every case regardless of the elicited vectors, that points to the scoring formulas (such as the /30 km constant, a disclosed limitation) and not to the weighting, and would be flagged for the supervisor and not silently accepted. The sensitivity check above also serves as the fairness check requested in Week 2 feedback: it shows how rankings move if the judge's subjective inputs change.</w:t>
+        <w:t xml:space="preserve">The harness logs which weight factor decides the winner in each case. If one factor (for example proximity) decides nearly every case regardless of the elicited vectors, that points to the scoring formulas (such as the /30 km constant, a disclosed limitation) and not to the weighting, and would be flagged for the supervisor and not silently accepted.</w:t>
+      </w:r>
+    </w:p>
+    <w:p>
+      <w:pPr>
+        <w:keepNext/>
+        <w:spacing w:after="100" w:before="200" w:line="264"/>
+      </w:pPr>
+      <w:r>
+        <w:rPr>
+          <w:rFonts w:ascii="Calibri" w:cs="Calibri" w:eastAsia="Calibri" w:hAnsi="Calibri"/>
+          <w:b/>
+          <w:bCs/>
+          <w:color w:val="0A3A35"/>
+          <w:sz w:val="24"/>
+          <w:szCs w:val="24"/>
+        </w:rPr>
+        <w:t xml:space="preserve">Fairness Check: Scoring by Shelter Characteristic (Week 2 Feedback)</w:t>
+      </w:r>
+    </w:p>
+    <w:p>
+      <w:pPr>
+        <w:spacing w:after="120" w:before="0" w:line="264"/>
+        <w:jc w:val="both"/>
+      </w:pPr>
+      <w:r>
+        <w:rPr>
+          <w:rFonts w:ascii="Calibri" w:cs="Calibri" w:eastAsia="Calibri" w:hAnsi="Calibri"/>
+          <w:sz w:val="22"/>
+          <w:szCs w:val="22"/>
+        </w:rPr>
+        <w:t xml:space="preserve">Week 2 feedback asked for two distinct things under this heading, and only the first was built into the original plan above. Restated precisely: "AHP judgments may systematically privilege particular shelter characteristics, geographic areas, or operational capacities... include a simple sensitivity/fairness check showing how shelter rankings change when AHP judgments or input factors vary." The sensitivity check (Section 8, above) answers the "AHP judgments vary" half: is the elicitation robust to small changes in the judge's input. It does not answer the "input factors vary" half: once the weights are fixed, does the scoring formula itself systematically favor a class of shelter regardless of case merit. This subsection adds that second, missing check.</w:t>
+      </w:r>
+    </w:p>
+    <w:p>
+      <w:pPr>
+        <w:spacing w:after="120" w:before="0" w:line="264"/>
+        <w:jc w:val="both"/>
+      </w:pPr>
+      <w:r>
+        <w:rPr>
+          <w:rFonts w:ascii="Calibri" w:cs="Calibri" w:eastAsia="Calibri" w:hAnsi="Calibri"/>
+          <w:sz w:val="22"/>
+          <w:szCs w:val="22"/>
+        </w:rPr>
+        <w:t xml:space="preserve">Method: for every case in the evaluation set, record each eligible bidding shelter's characteristics (tier, has_vet, distance bucket, dataFreshness) alongside its v2 match score and whether it won. For each characteristic value, compute its won share (fraction of cases it won) against its eligible share (fraction of cases in which a shelter with that characteristic was bidding at all). A characteristic whose won share exceeds its eligible share by a wide margin, with no case-merit reason (such as a case's own hard constraints requiring vet care), is flagged for the Week 7 midpoint rather than accepted as a good outcome.</w:t>
+      </w:r>
+    </w:p>
+    <w:tbl>
+      <w:tblPr>
+        <w:tblW w:type="dxa" w:w="9360"/>
+        <w:tblBorders>
+          <w:top w:val="single" w:color="999999" w:sz="4"/>
+          <w:left w:val="single" w:color="999999" w:sz="4"/>
+          <w:bottom w:val="single" w:color="999999" w:sz="4"/>
+          <w:right w:val="single" w:color="999999" w:sz="4"/>
+          <w:insideH w:val="single" w:color="CCCCCC" w:sz="2"/>
+          <w:insideV w:val="single" w:color="CCCCCC" w:sz="2"/>
+        </w:tblBorders>
+      </w:tblPr>
+      <w:tblGrid>
+        <w:gridCol w:w="1800"/>
+        <w:gridCol w:w="3200"/>
+        <w:gridCol w:w="4360"/>
+      </w:tblGrid>
+      <w:tr>
+        <w:trPr>
+          <w:cantSplit/>
+          <w:tblHeader/>
+        </w:trPr>
+        <w:tc>
+          <w:tcPr>
+            <w:tcW w:type="dxa" w:w="1800"/>
+            <w:shd w:fill="E8F3EF" w:val="clear"/>
+            <w:tcMar>
+              <w:top w:type="dxa" w:w="80"/>
+              <w:left w:type="dxa" w:w="100"/>
+              <w:bottom w:type="dxa" w:w="80"/>
+              <w:right w:type="dxa" w:w="100"/>
+            </w:tcMar>
+            <w:vAlign w:val="top"/>
+          </w:tcPr>
+          <w:p>
+            <w:pPr>
+              <w:spacing w:after="0" w:before="0" w:line="250"/>
+            </w:pPr>
+            <w:r>
+              <w:rPr>
+                <w:rFonts w:ascii="Calibri" w:cs="Calibri" w:eastAsia="Calibri" w:hAnsi="Calibri"/>
+                <w:b/>
+                <w:bCs/>
+                <w:sz w:val="20"/>
+                <w:szCs w:val="20"/>
+              </w:rPr>
+              <w:t xml:space="preserve">Characteristic</w:t>
+            </w:r>
+          </w:p>
+        </w:tc>
+        <w:tc>
+          <w:tcPr>
+            <w:tcW w:type="dxa" w:w="3200"/>
+            <w:shd w:fill="E8F3EF" w:val="clear"/>
+            <w:tcMar>
+              <w:top w:type="dxa" w:w="80"/>
+              <w:left w:type="dxa" w:w="100"/>
+              <w:bottom w:type="dxa" w:w="80"/>
+              <w:right w:type="dxa" w:w="100"/>
+            </w:tcMar>
+            <w:vAlign w:val="top"/>
+          </w:tcPr>
+          <w:p>
+            <w:pPr>
+              <w:spacing w:after="0" w:before="0" w:line="250"/>
+            </w:pPr>
+            <w:r>
+              <w:rPr>
+                <w:rFonts w:ascii="Calibri" w:cs="Calibri" w:eastAsia="Calibri" w:hAnsi="Calibri"/>
+                <w:b/>
+                <w:bCs/>
+                <w:sz w:val="20"/>
+                <w:szCs w:val="20"/>
+              </w:rPr>
+              <w:t xml:space="preserve">Example Values</w:t>
+            </w:r>
+          </w:p>
+        </w:tc>
+        <w:tc>
+          <w:tcPr>
+            <w:tcW w:type="dxa" w:w="4360"/>
+            <w:shd w:fill="E8F3EF" w:val="clear"/>
+            <w:tcMar>
+              <w:top w:type="dxa" w:w="80"/>
+              <w:left w:type="dxa" w:w="100"/>
+              <w:bottom w:type="dxa" w:w="80"/>
+              <w:right w:type="dxa" w:w="100"/>
+            </w:tcMar>
+            <w:vAlign w:val="top"/>
+          </w:tcPr>
+          <w:p>
+            <w:pPr>
+              <w:spacing w:after="0" w:before="0" w:line="250"/>
+            </w:pPr>
+            <w:r>
+              <w:rPr>
+                <w:rFonts w:ascii="Calibri" w:cs="Calibri" w:eastAsia="Calibri" w:hAnsi="Calibri"/>
+                <w:b/>
+                <w:bCs/>
+                <w:sz w:val="20"/>
+                <w:szCs w:val="20"/>
+              </w:rPr>
+              <w:t xml:space="preserve">What Would Be Suspicious</w:t>
+            </w:r>
+          </w:p>
+        </w:tc>
+      </w:tr>
+      <w:tr>
+        <w:trPr>
+          <w:cantSplit/>
+        </w:trPr>
+        <w:tc>
+          <w:tcPr>
+            <w:tcW w:type="dxa" w:w="1800"/>
+            <w:tcMar>
+              <w:top w:type="dxa" w:w="80"/>
+              <w:left w:type="dxa" w:w="100"/>
+              <w:bottom w:type="dxa" w:w="80"/>
+              <w:right w:type="dxa" w:w="100"/>
+            </w:tcMar>
+            <w:vAlign w:val="top"/>
+          </w:tcPr>
+          <w:p>
+            <w:pPr>
+              <w:spacing w:after="0" w:before="0" w:line="250"/>
+            </w:pPr>
+            <w:r>
+              <w:rPr>
+                <w:rFonts w:ascii="Calibri" w:cs="Calibri" w:eastAsia="Calibri" w:hAnsi="Calibri"/>
+                <w:b w:val="false"/>
+                <w:bCs w:val="false"/>
+                <w:sz w:val="20"/>
+                <w:szCs w:val="20"/>
+              </w:rPr>
+              <w:t xml:space="preserve">Tier</w:t>
+            </w:r>
+          </w:p>
+        </w:tc>
+        <w:tc>
+          <w:tcPr>
+            <w:tcW w:type="dxa" w:w="3200"/>
+            <w:tcMar>
+              <w:top w:type="dxa" w:w="80"/>
+              <w:left w:type="dxa" w:w="100"/>
+              <w:bottom w:type="dxa" w:w="80"/>
+              <w:right w:type="dxa" w:w="100"/>
+            </w:tcMar>
+            <w:vAlign w:val="top"/>
+          </w:tcPr>
+          <w:p>
+            <w:pPr>
+              <w:spacing w:after="0" w:before="0" w:line="250"/>
+            </w:pPr>
+            <w:r>
+              <w:rPr>
+                <w:rFonts w:ascii="Calibri" w:cs="Calibri" w:eastAsia="Calibri" w:hAnsi="Calibri"/>
+                <w:b w:val="false"/>
+                <w:bCs w:val="false"/>
+                <w:sz w:val="20"/>
+                <w:szCs w:val="20"/>
+              </w:rPr>
+              <w:t xml:space="preserve">Tier 1 (automated) vs. Tier 2 (Slack Q&amp;A)</w:t>
+            </w:r>
+          </w:p>
+        </w:tc>
+        <w:tc>
+          <w:tcPr>
+            <w:tcW w:type="dxa" w:w="4360"/>
+            <w:tcMar>
+              <w:top w:type="dxa" w:w="80"/>
+              <w:left w:type="dxa" w:w="100"/>
+              <w:bottom w:type="dxa" w:w="80"/>
+              <w:right w:type="dxa" w:w="100"/>
+            </w:tcMar>
+            <w:vAlign w:val="top"/>
+          </w:tcPr>
+          <w:p>
+            <w:pPr>
+              <w:spacing w:after="0" w:before="0" w:line="250"/>
+            </w:pPr>
+            <w:r>
+              <w:rPr>
+                <w:rFonts w:ascii="Calibri" w:cs="Calibri" w:eastAsia="Calibri" w:hAnsi="Calibri"/>
+                <w:b w:val="false"/>
+                <w:bCs w:val="false"/>
+                <w:sz w:val="20"/>
+                <w:szCs w:val="20"/>
+              </w:rPr>
+              <w:t xml:space="preserve">One tier winning far more than its share of eligible bids, with no case reason (e.g., urgency requiring the faster tier-1 turnaround).</w:t>
+            </w:r>
+          </w:p>
+        </w:tc>
+      </w:tr>
+      <w:tr>
+        <w:trPr>
+          <w:cantSplit/>
+        </w:trPr>
+        <w:tc>
+          <w:tcPr>
+            <w:tcW w:type="dxa" w:w="1800"/>
+            <w:tcMar>
+              <w:top w:type="dxa" w:w="80"/>
+              <w:left w:type="dxa" w:w="100"/>
+              <w:bottom w:type="dxa" w:w="80"/>
+              <w:right w:type="dxa" w:w="100"/>
+            </w:tcMar>
+            <w:vAlign w:val="top"/>
+          </w:tcPr>
+          <w:p>
+            <w:pPr>
+              <w:spacing w:after="0" w:before="0" w:line="250"/>
+            </w:pPr>
+            <w:r>
+              <w:rPr>
+                <w:rFonts w:ascii="Calibri" w:cs="Calibri" w:eastAsia="Calibri" w:hAnsi="Calibri"/>
+                <w:b w:val="false"/>
+                <w:bCs w:val="false"/>
+                <w:sz w:val="20"/>
+                <w:szCs w:val="20"/>
+              </w:rPr>
+              <w:t xml:space="preserve">Vet availability</w:t>
+            </w:r>
+          </w:p>
+        </w:tc>
+        <w:tc>
+          <w:tcPr>
+            <w:tcW w:type="dxa" w:w="3200"/>
+            <w:tcMar>
+              <w:top w:type="dxa" w:w="80"/>
+              <w:left w:type="dxa" w:w="100"/>
+              <w:bottom w:type="dxa" w:w="80"/>
+              <w:right w:type="dxa" w:w="100"/>
+            </w:tcMar>
+            <w:vAlign w:val="top"/>
+          </w:tcPr>
+          <w:p>
+            <w:pPr>
+              <w:spacing w:after="0" w:before="0" w:line="250"/>
+            </w:pPr>
+            <w:r>
+              <w:rPr>
+                <w:rFonts w:ascii="Calibri" w:cs="Calibri" w:eastAsia="Calibri" w:hAnsi="Calibri"/>
+                <w:b w:val="false"/>
+                <w:bCs w:val="false"/>
+                <w:sz w:val="20"/>
+                <w:szCs w:val="20"/>
+              </w:rPr>
+              <w:t xml:space="preserve">has_vet vs. vet-can-be-arranged vs. none</w:t>
+            </w:r>
+          </w:p>
+        </w:tc>
+        <w:tc>
+          <w:tcPr>
+            <w:tcW w:type="dxa" w:w="4360"/>
+            <w:tcMar>
+              <w:top w:type="dxa" w:w="80"/>
+              <w:left w:type="dxa" w:w="100"/>
+              <w:bottom w:type="dxa" w:w="80"/>
+              <w:right w:type="dxa" w:w="100"/>
+            </w:tcMar>
+            <w:vAlign w:val="top"/>
+          </w:tcPr>
+          <w:p>
+            <w:pPr>
+              <w:spacing w:after="0" w:before="0" w:line="250"/>
+            </w:pPr>
+            <w:r>
+              <w:rPr>
+                <w:rFonts w:ascii="Calibri" w:cs="Calibri" w:eastAsia="Calibri" w:hAnsi="Calibri"/>
+                <w:b w:val="false"/>
+                <w:bCs w:val="false"/>
+                <w:sz w:val="20"/>
+                <w:szCs w:val="20"/>
+              </w:rPr>
+              <w:t xml:space="preserve">A no-vet shelter winning injured-animal cases (this would also fail the hard-constraint check, so it is a second, independent tripwire).</w:t>
+            </w:r>
+          </w:p>
+        </w:tc>
+      </w:tr>
+      <w:tr>
+        <w:trPr>
+          <w:cantSplit/>
+        </w:trPr>
+        <w:tc>
+          <w:tcPr>
+            <w:tcW w:type="dxa" w:w="1800"/>
+            <w:tcMar>
+              <w:top w:type="dxa" w:w="80"/>
+              <w:left w:type="dxa" w:w="100"/>
+              <w:bottom w:type="dxa" w:w="80"/>
+              <w:right w:type="dxa" w:w="100"/>
+            </w:tcMar>
+            <w:vAlign w:val="top"/>
+          </w:tcPr>
+          <w:p>
+            <w:pPr>
+              <w:spacing w:after="0" w:before="0" w:line="250"/>
+            </w:pPr>
+            <w:r>
+              <w:rPr>
+                <w:rFonts w:ascii="Calibri" w:cs="Calibri" w:eastAsia="Calibri" w:hAnsi="Calibri"/>
+                <w:b w:val="false"/>
+                <w:bCs w:val="false"/>
+                <w:sz w:val="20"/>
+                <w:szCs w:val="20"/>
+              </w:rPr>
+              <w:t xml:space="preserve">Distance bucket</w:t>
+            </w:r>
+          </w:p>
+        </w:tc>
+        <w:tc>
+          <w:tcPr>
+            <w:tcW w:type="dxa" w:w="3200"/>
+            <w:tcMar>
+              <w:top w:type="dxa" w:w="80"/>
+              <w:left w:type="dxa" w:w="100"/>
+              <w:bottom w:type="dxa" w:w="80"/>
+              <w:right w:type="dxa" w:w="100"/>
+            </w:tcMar>
+            <w:vAlign w:val="top"/>
+          </w:tcPr>
+          <w:p>
+            <w:pPr>
+              <w:spacing w:after="0" w:before="0" w:line="250"/>
+            </w:pPr>
+            <w:r>
+              <w:rPr>
+                <w:rFonts w:ascii="Calibri" w:cs="Calibri" w:eastAsia="Calibri" w:hAnsi="Calibri"/>
+                <w:b w:val="false"/>
+                <w:bCs w:val="false"/>
+                <w:sz w:val="20"/>
+                <w:szCs w:val="20"/>
+              </w:rPr>
+              <w:t xml:space="preserve">Near (&lt;10 km) vs. far (&gt;=10 km)</w:t>
+            </w:r>
+          </w:p>
+        </w:tc>
+        <w:tc>
+          <w:tcPr>
+            <w:tcW w:type="dxa" w:w="4360"/>
+            <w:tcMar>
+              <w:top w:type="dxa" w:w="80"/>
+              <w:left w:type="dxa" w:w="100"/>
+              <w:bottom w:type="dxa" w:w="80"/>
+              <w:right w:type="dxa" w:w="100"/>
+            </w:tcMar>
+            <w:vAlign w:val="top"/>
+          </w:tcPr>
+          <w:p>
+            <w:pPr>
+              <w:spacing w:after="0" w:before="0" w:line="250"/>
+            </w:pPr>
+            <w:r>
+              <w:rPr>
+                <w:rFonts w:ascii="Calibri" w:cs="Calibri" w:eastAsia="Calibri" w:hAnsi="Calibri"/>
+                <w:b w:val="false"/>
+                <w:bCs w:val="false"/>
+                <w:sz w:val="20"/>
+                <w:szCs w:val="20"/>
+              </w:rPr>
+              <w:t xml:space="preserve">Far shelters never winning even when nearer options have no slots or lack the needed species (would point to the disclosed /30 km normalization limitation).</w:t>
+            </w:r>
+          </w:p>
+        </w:tc>
+      </w:tr>
+      <w:tr>
+        <w:trPr>
+          <w:cantSplit/>
+        </w:trPr>
+        <w:tc>
+          <w:tcPr>
+            <w:tcW w:type="dxa" w:w="1800"/>
+            <w:tcMar>
+              <w:top w:type="dxa" w:w="80"/>
+              <w:left w:type="dxa" w:w="100"/>
+              <w:bottom w:type="dxa" w:w="80"/>
+              <w:right w:type="dxa" w:w="100"/>
+            </w:tcMar>
+            <w:vAlign w:val="top"/>
+          </w:tcPr>
+          <w:p>
+            <w:pPr>
+              <w:spacing w:after="0" w:before="0" w:line="250"/>
+            </w:pPr>
+            <w:r>
+              <w:rPr>
+                <w:rFonts w:ascii="Calibri" w:cs="Calibri" w:eastAsia="Calibri" w:hAnsi="Calibri"/>
+                <w:b w:val="false"/>
+                <w:bCs w:val="false"/>
+                <w:sz w:val="20"/>
+                <w:szCs w:val="20"/>
+              </w:rPr>
+              <w:t xml:space="preserve">Data freshness</w:t>
+            </w:r>
+          </w:p>
+        </w:tc>
+        <w:tc>
+          <w:tcPr>
+            <w:tcW w:type="dxa" w:w="3200"/>
+            <w:tcMar>
+              <w:top w:type="dxa" w:w="80"/>
+              <w:left w:type="dxa" w:w="100"/>
+              <w:bottom w:type="dxa" w:w="80"/>
+              <w:right w:type="dxa" w:w="100"/>
+            </w:tcMar>
+            <w:vAlign w:val="top"/>
+          </w:tcPr>
+          <w:p>
+            <w:pPr>
+              <w:spacing w:after="0" w:before="0" w:line="250"/>
+            </w:pPr>
+            <w:r>
+              <w:rPr>
+                <w:rFonts w:ascii="Calibri" w:cs="Calibri" w:eastAsia="Calibri" w:hAnsi="Calibri"/>
+                <w:b w:val="false"/>
+                <w:bCs w:val="false"/>
+                <w:sz w:val="20"/>
+                <w:szCs w:val="20"/>
+              </w:rPr>
+              <w:t xml:space="preserve">LIVE vs. HUMAN vs. SYNCED vs. STATIC</w:t>
+            </w:r>
+          </w:p>
+        </w:tc>
+        <w:tc>
+          <w:tcPr>
+            <w:tcW w:type="dxa" w:w="4360"/>
+            <w:tcMar>
+              <w:top w:type="dxa" w:w="80"/>
+              <w:left w:type="dxa" w:w="100"/>
+              <w:bottom w:type="dxa" w:w="80"/>
+              <w:right w:type="dxa" w:w="100"/>
+            </w:tcMar>
+            <w:vAlign w:val="top"/>
+          </w:tcPr>
+          <w:p>
+            <w:pPr>
+              <w:spacing w:after="0" w:before="0" w:line="250"/>
+            </w:pPr>
+            <w:r>
+              <w:rPr>
+                <w:rFonts w:ascii="Calibri" w:cs="Calibri" w:eastAsia="Calibri" w:hAnsi="Calibri"/>
+                <w:b w:val="false"/>
+                <w:bCs w:val="false"/>
+                <w:sz w:val="20"/>
+                <w:szCs w:val="20"/>
+              </w:rPr>
+              <w:t xml:space="preserve">STATIC/seeded shelters winning disproportionately just because they are always "available" on paper, crowding out live bids.</w:t>
+            </w:r>
+          </w:p>
+        </w:tc>
+      </w:tr>
+    </w:tbl>
+    <w:p>
+      <w:pPr>
+        <w:spacing w:after="0" w:before="0" w:line="264"/>
+      </w:pPr>
+      <w:r>
+        <w:rPr>
+          <w:rFonts w:ascii="Calibri" w:cs="Calibri" w:eastAsia="Calibri" w:hAnsi="Calibri"/>
+          <w:sz w:val="22"/>
+          <w:szCs w:val="22"/>
+        </w:rPr>
+        <w:t xml:space="preserve"/>
+      </w:r>
+    </w:p>
+    <w:p>
+      <w:pPr>
+        <w:spacing w:after="120" w:before="0" w:line="264"/>
+        <w:jc w:val="both"/>
+      </w:pPr>
+      <w:r>
+        <w:rPr>
+          <w:rFonts w:ascii="Calibri" w:cs="Calibri" w:eastAsia="Calibri" w:hAnsi="Calibri"/>
+          <w:sz w:val="22"/>
+          <w:szCs w:val="22"/>
+        </w:rPr>
+        <w:t xml:space="preserve">Honesty about statistical power: with 9 cases (1 real, 8 synthetic) this is a directional, illustrative check this term, not a statistically powered fairness audit — a skew observed on 9 cases could easily be chance rather than systematic bias. It is reported as counts (for example, "3 of 4 eligible tier-1 wins"), not percentages, and is treated as a prompt for supervisor discussion at the Week 7 midpoint, not as proof of fairness or unfairness either way. A properly powered version of this check is future work once real case volume accumulates, the same constraint already disclosed for the comparison test (Section 8, above) and the classifier agreement test.</w:t>
       </w:r>
     </w:p>
     <w:p>
@@ -19683,6 +20789,146 @@
                 <w:szCs w:val="20"/>
               </w:rPr>
               <w:t xml:space="preserve">Exact repeatability; max delta in p at most 0.10 across repeats (provisional)</w:t>
+            </w:r>
+          </w:p>
+        </w:tc>
+      </w:tr>
+      <w:tr>
+        <w:trPr>
+          <w:cantSplit/>
+        </w:trPr>
+        <w:tc>
+          <w:tcPr>
+            <w:tcW w:type="dxa" w:w="1100"/>
+            <w:tcMar>
+              <w:top w:type="dxa" w:w="80"/>
+              <w:left w:type="dxa" w:w="100"/>
+              <w:bottom w:type="dxa" w:w="80"/>
+              <w:right w:type="dxa" w:w="100"/>
+            </w:tcMar>
+            <w:vAlign w:val="top"/>
+          </w:tcPr>
+          <w:p>
+            <w:pPr>
+              <w:spacing w:after="0" w:before="0" w:line="250"/>
+            </w:pPr>
+            <w:r>
+              <w:rPr>
+                <w:rFonts w:ascii="Calibri" w:cs="Calibri" w:eastAsia="Calibri" w:hAnsi="Calibri"/>
+                <w:b w:val="false"/>
+                <w:bCs w:val="false"/>
+                <w:sz w:val="20"/>
+                <w:szCs w:val="20"/>
+              </w:rPr>
+              <w:t xml:space="preserve">NFR7 (new)</w:t>
+            </w:r>
+          </w:p>
+        </w:tc>
+        <w:tc>
+          <w:tcPr>
+            <w:tcW w:type="dxa" w:w="2500"/>
+            <w:tcMar>
+              <w:top w:type="dxa" w:w="80"/>
+              <w:left w:type="dxa" w:w="100"/>
+              <w:bottom w:type="dxa" w:w="80"/>
+              <w:right w:type="dxa" w:w="100"/>
+            </w:tcMar>
+            <w:vAlign w:val="top"/>
+          </w:tcPr>
+          <w:p>
+            <w:pPr>
+              <w:spacing w:after="0" w:before="0" w:line="250"/>
+            </w:pPr>
+            <w:r>
+              <w:rPr>
+                <w:rFonts w:ascii="Calibri" w:cs="Calibri" w:eastAsia="Calibri" w:hAnsi="Calibri"/>
+                <w:b w:val="false"/>
+                <w:bCs w:val="false"/>
+                <w:sz w:val="20"/>
+                <w:szCs w:val="20"/>
+              </w:rPr>
+              <w:t xml:space="preserve">Scoring shall not systematically favor a shelter characteristic (tier, vet availability, distance, freshness) without case-merit justification</w:t>
+            </w:r>
+          </w:p>
+        </w:tc>
+        <w:tc>
+          <w:tcPr>
+            <w:tcW w:type="dxa" w:w="2000"/>
+            <w:tcMar>
+              <w:top w:type="dxa" w:w="80"/>
+              <w:left w:type="dxa" w:w="100"/>
+              <w:bottom w:type="dxa" w:w="80"/>
+              <w:right w:type="dxa" w:w="100"/>
+            </w:tcMar>
+            <w:vAlign w:val="top"/>
+          </w:tcPr>
+          <w:p>
+            <w:pPr>
+              <w:spacing w:after="0" w:before="0" w:line="250"/>
+            </w:pPr>
+            <w:r>
+              <w:rPr>
+                <w:rFonts w:ascii="Calibri" w:cs="Calibri" w:eastAsia="Calibri" w:hAnsi="Calibri"/>
+                <w:b w:val="false"/>
+                <w:bCs w:val="false"/>
+                <w:sz w:val="20"/>
+                <w:szCs w:val="20"/>
+              </w:rPr>
+              <w:t xml:space="preserve">Section 8 (Fairness Check)</w:t>
+            </w:r>
+          </w:p>
+        </w:tc>
+        <w:tc>
+          <w:tcPr>
+            <w:tcW w:type="dxa" w:w="1800"/>
+            <w:tcMar>
+              <w:top w:type="dxa" w:w="80"/>
+              <w:left w:type="dxa" w:w="100"/>
+              <w:bottom w:type="dxa" w:w="80"/>
+              <w:right w:type="dxa" w:w="100"/>
+            </w:tcMar>
+            <w:vAlign w:val="top"/>
+          </w:tcPr>
+          <w:p>
+            <w:pPr>
+              <w:spacing w:after="0" w:before="0" w:line="250"/>
+            </w:pPr>
+            <w:r>
+              <w:rPr>
+                <w:rFonts w:ascii="Calibri" w:cs="Calibri" w:eastAsia="Calibri" w:hAnsi="Calibri"/>
+                <w:b w:val="false"/>
+                <w:bCs w:val="false"/>
+                <w:sz w:val="20"/>
+                <w:szCs w:val="20"/>
+              </w:rPr>
+              <w:t xml:space="preserve">Won-share vs. eligible-share breakdown by characteristic</w:t>
+            </w:r>
+          </w:p>
+        </w:tc>
+        <w:tc>
+          <w:tcPr>
+            <w:tcW w:type="dxa" w:w="1960"/>
+            <w:tcMar>
+              <w:top w:type="dxa" w:w="80"/>
+              <w:left w:type="dxa" w:w="100"/>
+              <w:bottom w:type="dxa" w:w="80"/>
+              <w:right w:type="dxa" w:w="100"/>
+            </w:tcMar>
+            <w:vAlign w:val="top"/>
+          </w:tcPr>
+          <w:p>
+            <w:pPr>
+              <w:spacing w:after="0" w:before="0" w:line="250"/>
+            </w:pPr>
+            <w:r>
+              <w:rPr>
+                <w:rFonts w:ascii="Calibri" w:cs="Calibri" w:eastAsia="Calibri" w:hAnsi="Calibri"/>
+                <w:b w:val="false"/>
+                <w:bCs w:val="false"/>
+                <w:sz w:val="20"/>
+                <w:szCs w:val="20"/>
+              </w:rPr>
+              <w:t xml:space="preserve">No characteristic's won share exceeds its eligible share by a wide, unexplained margin; reported as counts, flagged at Week 7 midpoint if seen</w:t>
             </w:r>
           </w:p>
         </w:tc>
@@ -20317,7 +21563,7 @@
                 <w:sz w:val="20"/>
                 <w:szCs w:val="20"/>
               </w:rPr>
-              <w:t xml:space="preserve">Full v1-vs-v2 comparison on all 9 cases; non-production latency and error-rate run with the flag on.</w:t>
+              <w:t xml:space="preserve">Full v1-vs-v2 comparison on all 9 cases; non-production latency and error-rate run with the flag on; fairness-by-characteristic breakdown (Section 8) computed and reported alongside it.</w:t>
             </w:r>
           </w:p>
         </w:tc>
@@ -20799,7 +22045,7 @@
           <w:sz w:val="22"/>
           <w:szCs w:val="22"/>
         </w:rPr>
-        <w:t xml:space="preserve">Reproduced in full, parsed directly from docs/AI_USE_LOG.md at the project root (Entries 1-16, cumulative across all submissions this term), not retyped by hand.</w:t>
+        <w:t xml:space="preserve">Reproduced in full, parsed directly from docs/AI_USE_LOG.md at the project root (Entries 1-17, cumulative across all submissions this term), not retyped by hand.</w:t>
       </w:r>
     </w:p>
     <w:p>

</xml_diff>